<commit_message>
Perfiles v2: KPI principal, motivos de despido, firma de aceptación y sueldos editables
Cada Word es anexo del contrato: KPI principal con meta, medición y alerta;
qué pasa si no se llega (plan de mejora, nunca despido sin indemnización);
motivos de despido del puesto, de la obra y del art. 47 LFT; lo que nunca
es motivo; y hoja de aceptación con nombre a mano, firma, fecha y lugar.
Tabla de sueldos en la página: el Word y el ZIP se descargan con el sueldo
nuevo (los montos van en corridas M_* que el navegador reescribe).
RLR · EYE · 181218

Co-Authored-By: Claude Opus 5.5 <noreply@anthropic.com>
</commit_message>
<xml_diff>
--- a/perfiles/01-director-de-proyecto.docx
+++ b/perfiles/01-director-de-proyecto.docx
@@ -10,7 +10,7 @@
           <w:color w:val="0B7A55"/>
           <w:sz w:val="18"/>
         </w:rPr>
-        <w:t>CARRETERAS DE MÉXICO · PERFIL DE PUESTO Y MANUAL DE INGRESO</w:t>
+        <w:t>CARRETERAS DE MÉXICO · PERFIL DE PUESTO, CAPACITACIÓN Y CONDICIONES</w:t>
       </w:r>
     </w:p>
     <w:p>
@@ -95,6 +95,7 @@
             <w:r>
               <w:rPr>
                 <w:b w:val="0"/>
+                <w:i w:val="0"/>
                 <w:sz w:val="19"/>
               </w:rPr>
               <w:t>Línea</w:t>
@@ -110,6 +111,7 @@
             <w:r>
               <w:rPr>
                 <w:b w:val="0"/>
+                <w:i w:val="0"/>
                 <w:sz w:val="19"/>
               </w:rPr>
               <w:t>Dirección</w:t>
@@ -127,6 +129,7 @@
             <w:r>
               <w:rPr>
                 <w:b w:val="0"/>
+                <w:i w:val="0"/>
                 <w:sz w:val="19"/>
               </w:rPr>
               <w:t>Reporta a</w:t>
@@ -142,6 +145,7 @@
             <w:r>
               <w:rPr>
                 <w:b w:val="0"/>
+                <w:i w:val="0"/>
                 <w:sz w:val="19"/>
               </w:rPr>
               <w:t>Dirección general de la empresa</w:t>
@@ -159,6 +163,7 @@
             <w:r>
               <w:rPr>
                 <w:b w:val="0"/>
+                <w:i w:val="0"/>
                 <w:sz w:val="19"/>
               </w:rPr>
               <w:t>Grupo</w:t>
@@ -174,6 +179,7 @@
             <w:r>
               <w:rPr>
                 <w:b w:val="0"/>
+                <w:i w:val="0"/>
                 <w:sz w:val="19"/>
               </w:rPr>
               <w:t>Estructura de proyecto</w:t>
@@ -191,6 +197,7 @@
             <w:r>
               <w:rPr>
                 <w:b w:val="0"/>
+                <w:i w:val="0"/>
                 <w:sz w:val="19"/>
               </w:rPr>
               <w:t>Plazas</w:t>
@@ -206,6 +213,7 @@
             <w:r>
               <w:rPr>
                 <w:b w:val="0"/>
+                <w:i w:val="0"/>
                 <w:sz w:val="19"/>
               </w:rPr>
               <w:t>1 por proyecto, compartida entre frentes</w:t>
@@ -223,6 +231,7 @@
             <w:r>
               <w:rPr>
                 <w:b w:val="0"/>
+                <w:i w:val="0"/>
                 <w:sz w:val="19"/>
               </w:rPr>
               <w:t>Turno</w:t>
@@ -238,6 +247,7 @@
             <w:r>
               <w:rPr>
                 <w:b w:val="0"/>
+                <w:i w:val="0"/>
                 <w:sz w:val="19"/>
               </w:rPr>
               <w:t>día, con guardia</w:t>
@@ -255,9 +265,10 @@
             <w:r>
               <w:rPr>
                 <w:b w:val="0"/>
+                <w:i w:val="0"/>
                 <w:sz w:val="19"/>
               </w:rPr>
-              <w:t>Sueldo mensual bruto de referencia</w:t>
+              <w:t>Sueldo mensual bruto</w:t>
             </w:r>
           </w:p>
         </w:tc>
@@ -269,7 +280,9 @@
             <w:r/>
             <w:r>
               <w:rPr>
-                <w:b w:val="0"/>
+                <w:rStyle w:val="M_base"/>
+                <w:b/>
+                <w:i w:val="0"/>
                 <w:sz w:val="19"/>
               </w:rPr>
               <w:t>$230,000</w:t>
@@ -287,6 +300,7 @@
             <w:r>
               <w:rPr>
                 <w:b w:val="0"/>
+                <w:i w:val="0"/>
                 <w:sz w:val="19"/>
               </w:rPr>
               <w:t>Variable por metas</w:t>
@@ -301,10 +315,79 @@
             <w:r/>
             <w:r>
               <w:rPr>
+                <w:rStyle w:val="M_varp"/>
                 <w:b w:val="0"/>
+                <w:i w:val="0"/>
                 <w:sz w:val="19"/>
               </w:rPr>
-              <w:t>30 % del sueldo anual · $828,000</w:t>
+              <w:t>30</w:t>
+            </w:r>
+            <w:r>
+              <w:rPr>
+                <w:b w:val="0"/>
+                <w:i w:val="0"/>
+                <w:sz w:val="19"/>
+              </w:rPr>
+              <w:t xml:space="preserve"> % del sueldo anual · </w:t>
+            </w:r>
+            <w:r>
+              <w:rPr>
+                <w:rStyle w:val="M_var"/>
+                <w:b w:val="0"/>
+                <w:i w:val="0"/>
+                <w:sz w:val="19"/>
+              </w:rPr>
+              <w:t>$828,000</w:t>
+            </w:r>
+            <w:r>
+              <w:rPr>
+                <w:b w:val="0"/>
+                <w:i w:val="0"/>
+                <w:sz w:val="19"/>
+              </w:rPr>
+              <w:t xml:space="preserve"> al año</w:t>
+            </w:r>
+          </w:p>
+        </w:tc>
+      </w:tr>
+      <w:tr>
+        <w:tc>
+          <w:tcPr>
+            <w:tcW w:type="dxa" w:w="3118"/>
+          </w:tcPr>
+          <w:p>
+            <w:r/>
+            <w:r>
+              <w:rPr>
+                <w:b w:val="0"/>
+                <w:i w:val="0"/>
+                <w:sz w:val="19"/>
+              </w:rPr>
+              <w:t>KPI principal</w:t>
+            </w:r>
+          </w:p>
+        </w:tc>
+        <w:tc>
+          <w:tcPr>
+            <w:tcW w:type="dxa" w:w="6520"/>
+          </w:tcPr>
+          <w:p>
+            <w:r/>
+            <w:r>
+              <w:rPr>
+                <w:b/>
+                <w:i w:val="0"/>
+                <w:sz w:val="19"/>
+              </w:rPr>
+              <w:t>Km-carril aceptados contra programa</w:t>
+            </w:r>
+            <w:r>
+              <w:rPr>
+                <w:b w:val="0"/>
+                <w:i w:val="0"/>
+                <w:sz w:val="19"/>
+              </w:rPr>
+              <w:t xml:space="preserve"> · 100 % del programa trimestral, con cero desviaciones sin firma y núcleos, IRI y permeabilidad dentro de especificación</w:t>
             </w:r>
           </w:p>
         </w:tc>
@@ -319,7 +402,7 @@
           <w:color w:val="555F78"/>
           <w:sz w:val="18"/>
         </w:rPr>
-        <w:t>Versión 1 · 29 de septiembre de 2026 · Torreón, Coahuila, México</w:t>
+        <w:t>Versión 2 · 29 de septiembre de 2026 · Torreón, Coahuila, México · Anexo al contrato individual de trabajo</w:t>
       </w:r>
     </w:p>
     <w:p>
@@ -365,7 +448,7 @@
           <w:b w:val="0"/>
           <w:i w:val="0"/>
         </w:rPr>
-        <w:t xml:space="preserve"> se entrega completo el día de la oferta. Se lee todo antes del primer turno; las partes 2 y 3 son lo que tiene que saber y cómo la vamos a formar.</w:t>
+        <w:t xml:space="preserve"> se entrega completo el día de la oferta y se lee todo antes del primer turno. Dice lo que tiene que saber, cómo la vamos a formar, con qué número se le mide, cuánto gana y por qué motivos exactos se le puede despedir.</w:t>
       </w:r>
     </w:p>
     <w:p>
@@ -377,14 +460,14 @@
           <w:b/>
           <w:i w:val="0"/>
         </w:rPr>
-        <w:t>Para cerrar el ingreso:</w:t>
+        <w:t>Para cerrar la contratación:</w:t>
       </w:r>
       <w:r>
         <w:rPr>
           <w:b w:val="0"/>
           <w:i w:val="0"/>
         </w:rPr>
-        <w:t xml:space="preserve"> al final del periodo de capacitación se hacen las preguntas de comprobación y se firma la constancia de lectura.</w:t>
+        <w:t xml:space="preserve"> la última hoja se firma de aceptado, con nombre escrito a mano, firma y fecha. Una copia firmada va al expediente y otra se queda con la persona.</w:t>
       </w:r>
     </w:p>
     <w:p>
@@ -913,6 +996,7 @@
             <w:r>
               <w:rPr>
                 <w:b w:val="0"/>
+                <w:i w:val="0"/>
                 <w:sz w:val="19"/>
               </w:rPr>
               <w:t>Cuénteme de un colado que usted detuvo o que le detuvieron. ¿Qué pasó después?</w:t>
@@ -928,6 +1012,7 @@
             <w:r>
               <w:rPr>
                 <w:b w:val="0"/>
+                <w:i w:val="0"/>
                 <w:sz w:val="19"/>
               </w:rPr>
               <w:t>Que respaldó la detención, entendió la causa y cambió algo en el proceso, no que buscó un culpable.</w:t>
@@ -945,6 +1030,7 @@
             <w:r>
               <w:rPr>
                 <w:b w:val="0"/>
+                <w:i w:val="0"/>
                 <w:sz w:val="19"/>
               </w:rPr>
               <w:t>El cliente pide acelerar 30 % el programa. ¿Qué hace?</w:t>
@@ -960,6 +1046,7 @@
             <w:r>
               <w:rPr>
                 <w:b w:val="0"/>
+                <w:i w:val="0"/>
                 <w:sz w:val="19"/>
               </w:rPr>
               <w:t>Que acelera clonando frentes y liberando derecho de vía, nunca apretando un solo tren ni recortando curado.</w:t>
@@ -977,6 +1064,7 @@
             <w:r>
               <w:rPr>
                 <w:b w:val="0"/>
+                <w:i w:val="0"/>
                 <w:sz w:val="19"/>
               </w:rPr>
               <w:t>Le ofrecen bajar la losa de 27 a 24 cm para cerrar el contrato. ¿Qué responde?</w:t>
@@ -992,6 +1080,7 @@
             <w:r>
               <w:rPr>
                 <w:b w:val="0"/>
+                <w:i w:val="0"/>
                 <w:sz w:val="19"/>
               </w:rPr>
               <w:t>Que el espesor se ajusta por tránsito con ingeniería; el drenaje, el suelo, el agua/cemento y el curado no se negocian nunca.</w:t>
@@ -1009,6 +1098,7 @@
             <w:r>
               <w:rPr>
                 <w:b w:val="0"/>
+                <w:i w:val="0"/>
                 <w:sz w:val="19"/>
               </w:rPr>
               <w:t>¿Cómo mide si un frente va a pararse la próxima semana?</w:t>
@@ -1024,6 +1114,7 @@
             <w:r>
               <w:rPr>
                 <w:b w:val="0"/>
+                <w:i w:val="0"/>
                 <w:sz w:val="19"/>
               </w:rPr>
               <w:t>Colchones de los frentes previos y kilómetros liberados por delante.</w:t>
@@ -1048,296 +1139,6 @@
           <w:i w:val="0"/>
         </w:rPr>
         <w:t>Caso escrito de 2 horas: se le entrega el tablero de una semana real con un colchón cayendo, dos camiones rechazados y un predio sin liberar. Debe decidir qué hace el lunes, a quién llama y qué deja por escrito. Se evalúa con el Gerente de calidad presente.</w:t>
-      </w:r>
-    </w:p>
-    <w:p>
-      <w:pPr>
-        <w:pStyle w:val="Heading2"/>
-      </w:pPr>
-      <w:r>
-        <w:t>Sueldo y variable</w:t>
-      </w:r>
-    </w:p>
-    <w:p>
-      <w:r>
-        <w:rPr>
-          <w:b w:val="0"/>
-          <w:i w:val="0"/>
-        </w:rPr>
-        <w:t xml:space="preserve">Sueldo mensual bruto de referencia: </w:t>
-      </w:r>
-      <w:r>
-        <w:rPr>
-          <w:b/>
-          <w:i w:val="0"/>
-        </w:rPr>
-        <w:t>$230,000</w:t>
-      </w:r>
-      <w:r>
-        <w:rPr>
-          <w:b w:val="0"/>
-          <w:i w:val="0"/>
-        </w:rPr>
-        <w:t xml:space="preserve">, más prestaciones de ley desde el primer día. Variable meta: </w:t>
-      </w:r>
-      <w:r>
-        <w:rPr>
-          <w:b/>
-          <w:i w:val="0"/>
-        </w:rPr>
-        <w:t>30 % del sueldo anual</w:t>
-      </w:r>
-      <w:r>
-        <w:rPr>
-          <w:b w:val="0"/>
-          <w:i w:val="0"/>
-        </w:rPr>
-        <w:t xml:space="preserve"> ($828,000).</w:t>
-      </w:r>
-    </w:p>
-    <w:p>
-      <w:r>
-        <w:rPr>
-          <w:b/>
-          <w:i w:val="0"/>
-        </w:rPr>
-        <w:t>Cómo se paga:</w:t>
-      </w:r>
-      <w:r>
-        <w:rPr>
-          <w:b w:val="0"/>
-          <w:i w:val="0"/>
-        </w:rPr>
-        <w:t xml:space="preserve"> cada año, pagado en tres partes.</w:t>
-      </w:r>
-    </w:p>
-    <w:tbl>
-      <w:tblPr>
-        <w:tblStyle w:val="TableGrid"/>
-        <w:tblW w:type="auto" w:w="0"/>
-        <w:jc w:val="center"/>
-        <w:tblLook w:firstColumn="1" w:firstRow="1" w:lastColumn="0" w:lastRow="0" w:noHBand="0" w:noVBand="1" w:val="04A0"/>
-      </w:tblPr>
-      <w:tblGrid>
-        <w:gridCol w:w="4873"/>
-        <w:gridCol w:w="4873"/>
-      </w:tblGrid>
-      <w:tr>
-        <w:tc>
-          <w:tcPr>
-            <w:tcW w:type="dxa" w:w="1417"/>
-            <w:shd w:val="clear" w:color="auto" w:fill="0039C8"/>
-          </w:tcPr>
-          <w:p>
-            <w:r/>
-            <w:r>
-              <w:rPr>
-                <w:b/>
-                <w:color w:val="FFFFFF"/>
-                <w:sz w:val="19"/>
-              </w:rPr>
-              <w:t>Peso</w:t>
-            </w:r>
-          </w:p>
-        </w:tc>
-        <w:tc>
-          <w:tcPr>
-            <w:tcW w:type="dxa" w:w="8220"/>
-            <w:shd w:val="clear" w:color="auto" w:fill="0039C8"/>
-          </w:tcPr>
-          <w:p>
-            <w:r/>
-            <w:r>
-              <w:rPr>
-                <w:b/>
-                <w:color w:val="FFFFFF"/>
-                <w:sz w:val="19"/>
-              </w:rPr>
-              <w:t>Meta</w:t>
-            </w:r>
-          </w:p>
-        </w:tc>
-      </w:tr>
-      <w:tr>
-        <w:tc>
-          <w:tcPr>
-            <w:tcW w:type="dxa" w:w="1417"/>
-          </w:tcPr>
-          <w:p>
-            <w:r/>
-            <w:r>
-              <w:rPr>
-                <w:b w:val="0"/>
-                <w:sz w:val="19"/>
-              </w:rPr>
-              <w:t>40 %</w:t>
-            </w:r>
-          </w:p>
-        </w:tc>
-        <w:tc>
-          <w:tcPr>
-            <w:tcW w:type="dxa" w:w="8220"/>
-          </w:tcPr>
-          <w:p>
-            <w:r/>
-            <w:r>
-              <w:rPr>
-                <w:b w:val="0"/>
-                <w:sz w:val="19"/>
-              </w:rPr>
-              <w:t>Al entregar el tramo</w:t>
-            </w:r>
-          </w:p>
-        </w:tc>
-      </w:tr>
-      <w:tr>
-        <w:tc>
-          <w:tcPr>
-            <w:tcW w:type="dxa" w:w="1417"/>
-          </w:tcPr>
-          <w:p>
-            <w:r/>
-            <w:r>
-              <w:rPr>
-                <w:b w:val="0"/>
-                <w:sz w:val="19"/>
-              </w:rPr>
-              <w:t>30 %</w:t>
-            </w:r>
-          </w:p>
-        </w:tc>
-        <w:tc>
-          <w:tcPr>
-            <w:tcW w:type="dxa" w:w="8220"/>
-          </w:tcPr>
-          <w:p>
-            <w:r/>
-            <w:r>
-              <w:rPr>
-                <w:b w:val="0"/>
-                <w:sz w:val="19"/>
-              </w:rPr>
-              <w:t>Al año 2, si el tramo cumple</w:t>
-            </w:r>
-          </w:p>
-        </w:tc>
-      </w:tr>
-      <w:tr>
-        <w:tc>
-          <w:tcPr>
-            <w:tcW w:type="dxa" w:w="1417"/>
-          </w:tcPr>
-          <w:p>
-            <w:r/>
-            <w:r>
-              <w:rPr>
-                <w:b w:val="0"/>
-                <w:sz w:val="19"/>
-              </w:rPr>
-              <w:t>30 %</w:t>
-            </w:r>
-          </w:p>
-        </w:tc>
-        <w:tc>
-          <w:tcPr>
-            <w:tcW w:type="dxa" w:w="8220"/>
-          </w:tcPr>
-          <w:p>
-            <w:r/>
-            <w:r>
-              <w:rPr>
-                <w:b w:val="0"/>
-                <w:sz w:val="19"/>
-              </w:rPr>
-              <w:t>Al año 5, si el tramo sigue cumpliendo la garantía (suavidad, agrietamiento, drenes)</w:t>
-            </w:r>
-          </w:p>
-        </w:tc>
-      </w:tr>
-    </w:tbl>
-    <w:p/>
-    <w:p>
-      <w:r>
-        <w:rPr>
-          <w:b/>
-          <w:i w:val="0"/>
-        </w:rPr>
-        <w:t>Tus indicadores:</w:t>
-      </w:r>
-    </w:p>
-    <w:p>
-      <w:pPr>
-        <w:pStyle w:val="ListBullet"/>
-      </w:pPr>
-      <w:r>
-        <w:rPr>
-          <w:b w:val="0"/>
-          <w:i w:val="0"/>
-        </w:rPr>
-        <w:t>Avance contra programa sin tocar los colchones mínimos.</w:t>
-      </w:r>
-    </w:p>
-    <w:p>
-      <w:pPr>
-        <w:pStyle w:val="ListBullet"/>
-      </w:pPr>
-      <w:r>
-        <w:rPr>
-          <w:b w:val="0"/>
-          <w:i w:val="0"/>
-        </w:rPr>
-        <w:t>Cero desviaciones sin firma; núcleos, IRI y permeabilidad dentro de especificación.</w:t>
-      </w:r>
-    </w:p>
-    <w:p>
-      <w:pPr>
-        <w:pStyle w:val="ListBullet"/>
-      </w:pPr>
-      <w:r>
-        <w:rPr>
-          <w:b w:val="0"/>
-          <w:i w:val="0"/>
-        </w:rPr>
-        <w:t>Margen del proyecto contra presupuesto.</w:t>
-      </w:r>
-    </w:p>
-    <w:p>
-      <w:pPr>
-        <w:pStyle w:val="ListBullet"/>
-      </w:pPr>
-      <w:r>
-        <w:rPr>
-          <w:b w:val="0"/>
-          <w:i w:val="0"/>
-        </w:rPr>
-        <w:t>Cero accidentes graves.</w:t>
-      </w:r>
-    </w:p>
-    <w:p>
-      <w:pPr>
-        <w:pStyle w:val="ListBullet"/>
-      </w:pPr>
-      <w:r>
-        <w:rPr>
-          <w:b w:val="0"/>
-          <w:i w:val="0"/>
-        </w:rPr>
-        <w:t>A los años 2 y 5: suavidad, agrietamiento y drenes del tramo entregado.</w:t>
-      </w:r>
-    </w:p>
-    <w:p>
-      <w:pPr>
-        <w:spacing w:before="120"/>
-        <w:ind w:left="340"/>
-      </w:pPr>
-      <w:r>
-        <w:rPr>
-          <w:b/>
-          <w:i w:val="0"/>
-          <w:color w:val="A86A00"/>
-          <w:sz w:val="23"/>
-        </w:rPr>
-        <w:t>Cobras cuando la carretera demuestra que dura.</w:t>
       </w:r>
     </w:p>
     <w:p>
@@ -1418,6 +1219,7 @@
             <w:r>
               <w:rPr>
                 <w:b w:val="0"/>
+                <w:i w:val="0"/>
                 <w:sz w:val="19"/>
               </w:rPr>
               <w:t>06:00</w:t>
@@ -1433,6 +1235,7 @@
             <w:r>
               <w:rPr>
                 <w:b w:val="0"/>
+                <w:i w:val="0"/>
                 <w:sz w:val="19"/>
               </w:rPr>
               <w:t>Junta de cierre con las cuatro líneas y el tablero de la noche.</w:t>
@@ -1450,6 +1253,7 @@
             <w:r>
               <w:rPr>
                 <w:b w:val="0"/>
+                <w:i w:val="0"/>
                 <w:sz w:val="19"/>
               </w:rPr>
               <w:t>Mañana</w:t>
@@ -1465,6 +1269,7 @@
             <w:r>
               <w:rPr>
                 <w:b w:val="0"/>
+                <w:i w:val="0"/>
                 <w:sz w:val="19"/>
               </w:rPr>
               <w:t>Liberaciones, cliente, compras mayores y visitas a frentes de día.</w:t>
@@ -1482,6 +1287,7 @@
             <w:r>
               <w:rPr>
                 <w:b w:val="0"/>
+                <w:i w:val="0"/>
                 <w:sz w:val="19"/>
               </w:rPr>
               <w:t>17:30</w:t>
@@ -1497,6 +1303,7 @@
             <w:r>
               <w:rPr>
                 <w:b w:val="0"/>
+                <w:i w:val="0"/>
                 <w:sz w:val="19"/>
               </w:rPr>
               <w:t>Revisa cómo se armó la noche; resuelve lo que ninguna línea puede resolver sola.</w:t>
@@ -1514,6 +1321,7 @@
             <w:r>
               <w:rPr>
                 <w:b w:val="0"/>
+                <w:i w:val="0"/>
                 <w:sz w:val="19"/>
               </w:rPr>
               <w:t>Noche (2 por semana)</w:t>
@@ -1529,6 +1337,7 @@
             <w:r>
               <w:rPr>
                 <w:b w:val="0"/>
+                <w:i w:val="0"/>
                 <w:sz w:val="19"/>
               </w:rPr>
               <w:t>Recorre el tren sin avisar; habla con operadores y laboratoristas.</w:t>
@@ -1546,6 +1355,7 @@
             <w:r>
               <w:rPr>
                 <w:b w:val="0"/>
+                <w:i w:val="0"/>
                 <w:sz w:val="19"/>
               </w:rPr>
               <w:t>Lunes</w:t>
@@ -1561,6 +1371,7 @@
             <w:r>
               <w:rPr>
                 <w:b w:val="0"/>
+                <w:i w:val="0"/>
                 <w:sz w:val="19"/>
               </w:rPr>
               <w:t>Junta de las dos semanas que vienen: colchones, liberaciones y mantenimiento mayor.</w:t>
@@ -1715,6 +1526,7 @@
             <w:r>
               <w:rPr>
                 <w:b w:val="0"/>
+                <w:i w:val="0"/>
                 <w:sz w:val="19"/>
               </w:rPr>
               <w:t>500 km-carril</w:t>
@@ -1730,6 +1542,7 @@
             <w:r>
               <w:rPr>
                 <w:b w:val="0"/>
+                <w:i w:val="0"/>
                 <w:sz w:val="19"/>
               </w:rPr>
               <w:t>lo que cuela un frente al año (1 km de 2 carriles por noche, 250 noches)</w:t>
@@ -1747,6 +1560,7 @@
             <w:r>
               <w:rPr>
                 <w:b w:val="0"/>
+                <w:i w:val="0"/>
                 <w:sz w:val="19"/>
               </w:rPr>
               <w:t>20 km</w:t>
@@ -1762,6 +1576,7 @@
             <w:r>
               <w:rPr>
                 <w:b w:val="0"/>
+                <w:i w:val="0"/>
                 <w:sz w:val="19"/>
               </w:rPr>
               <w:t>derecho de vía liberado siempre por delante; bajo 10 km se levanta la alarma</w:t>
@@ -1779,6 +1594,7 @@
             <w:r>
               <w:rPr>
                 <w:b w:val="0"/>
+                <w:i w:val="0"/>
                 <w:sz w:val="19"/>
               </w:rPr>
               <w:t>3 días</w:t>
@@ -1794,6 +1610,7 @@
             <w:r>
               <w:rPr>
                 <w:b w:val="0"/>
+                <w:i w:val="0"/>
                 <w:sz w:val="19"/>
               </w:rPr>
               <w:t>colchón mínimo de cada frente sobre el siguiente</w:t>
@@ -1811,6 +1628,7 @@
             <w:r>
               <w:rPr>
                 <w:b w:val="0"/>
+                <w:i w:val="0"/>
                 <w:sz w:val="19"/>
               </w:rPr>
               <w:t>5 %</w:t>
@@ -1826,6 +1644,7 @@
             <w:r>
               <w:rPr>
                 <w:b w:val="0"/>
+                <w:i w:val="0"/>
                 <w:sz w:val="19"/>
               </w:rPr>
               <w:t>del presupuesto a supervisión independiente y laboratorio con autoridad de rechazo</w:t>
@@ -1843,6 +1662,7 @@
             <w:r>
               <w:rPr>
                 <w:b w:val="0"/>
+                <w:i w:val="0"/>
                 <w:sz w:val="19"/>
               </w:rPr>
               <w:t>10 %</w:t>
@@ -1858,6 +1678,7 @@
             <w:r>
               <w:rPr>
                 <w:b w:val="0"/>
+                <w:i w:val="0"/>
                 <w:sz w:val="19"/>
               </w:rPr>
               <w:t>de la producción del día se pierde con una hora de paro del tren</w:t>
@@ -2039,6 +1860,7 @@
             <w:r>
               <w:rPr>
                 <w:b w:val="0"/>
+                <w:i w:val="0"/>
                 <w:sz w:val="19"/>
               </w:rPr>
               <w:t>1 · Agua atrapada</w:t>
@@ -2054,6 +1876,7 @@
             <w:r>
               <w:rPr>
                 <w:b w:val="0"/>
+                <w:i w:val="0"/>
                 <w:sz w:val="19"/>
               </w:rPr>
               <w:t>El agua entra, se queda debajo de la losa, cada tráiler la bombea y lava el suelo: la losa queda colgando y se rompe.</w:t>
@@ -2069,6 +1892,7 @@
             <w:r>
               <w:rPr>
                 <w:b w:val="0"/>
+                <w:i w:val="0"/>
                 <w:sz w:val="19"/>
               </w:rPr>
               <w:t>Drenaje de borde real, base tratada y losa impermeable</w:t>
@@ -2086,6 +1910,7 @@
             <w:r>
               <w:rPr>
                 <w:b w:val="0"/>
+                <w:i w:val="0"/>
                 <w:sz w:val="19"/>
               </w:rPr>
               <w:t>2 · Soporte desigual</w:t>
@@ -2101,6 +1926,7 @@
             <w:r>
               <w:rPr>
                 <w:b w:val="0"/>
+                <w:i w:val="0"/>
                 <w:sz w:val="19"/>
               </w:rPr>
               <w:t>Firme, blando, firme: la losa trabaja como tabla apoyada en tres puntos y se parte donde no tiene apoyo.</w:t>
@@ -2116,6 +1942,7 @@
             <w:r>
               <w:rPr>
                 <w:b w:val="0"/>
+                <w:i w:val="0"/>
                 <w:sz w:val="19"/>
               </w:rPr>
               <w:t>Compactación uniforme medida punto por punto</w:t>
@@ -2133,6 +1960,7 @@
             <w:r>
               <w:rPr>
                 <w:b w:val="0"/>
+                <w:i w:val="0"/>
                 <w:sz w:val="19"/>
               </w:rPr>
               <w:t>3 · Contracción</w:t>
@@ -2148,6 +1976,7 @@
             <w:r>
               <w:rPr>
                 <w:b w:val="0"/>
+                <w:i w:val="0"/>
                 <w:sz w:val="19"/>
               </w:rPr>
               <w:t>El concreto se encoge al secarse; si está amarrado se agrieta en los primeros días, y la grieta dura 50 años.</w:t>
@@ -2163,6 +1992,7 @@
             <w:r>
               <w:rPr>
                 <w:b w:val="0"/>
+                <w:i w:val="0"/>
                 <w:sz w:val="19"/>
               </w:rPr>
               <w:t>Menos cemento, curado interno e interfaz que deja deslizar</w:t>
@@ -2180,6 +2010,7 @@
             <w:r>
               <w:rPr>
                 <w:b w:val="0"/>
+                <w:i w:val="0"/>
                 <w:sz w:val="19"/>
               </w:rPr>
               <w:t>4 · Temperatura</w:t>
@@ -2195,6 +2026,7 @@
             <w:r>
               <w:rPr>
                 <w:b w:val="0"/>
+                <w:i w:val="0"/>
                 <w:sz w:val="19"/>
               </w:rPr>
               <w:t>El sol calienta la cara de arriba y la de abajo sigue fría: la losa se pandea todos los días.</w:t>
@@ -2210,6 +2042,7 @@
             <w:r>
               <w:rPr>
                 <w:b w:val="0"/>
+                <w:i w:val="0"/>
                 <w:sz w:val="19"/>
               </w:rPr>
               <w:t>Agregado calizo de baja expansión térmica</w:t>
@@ -2227,6 +2060,7 @@
             <w:r>
               <w:rPr>
                 <w:b w:val="0"/>
+                <w:i w:val="0"/>
                 <w:sz w:val="19"/>
               </w:rPr>
               <w:t>5 · Corrosión</w:t>
@@ -2242,6 +2076,7 @@
             <w:r>
               <w:rPr>
                 <w:b w:val="0"/>
+                <w:i w:val="0"/>
                 <w:sz w:val="19"/>
               </w:rPr>
               <w:t>El acero se oxida, se hincha y revienta el concreto desde dentro.</w:t>
@@ -2257,6 +2092,7 @@
             <w:r>
               <w:rPr>
                 <w:b w:val="0"/>
+                <w:i w:val="0"/>
                 <w:sz w:val="19"/>
               </w:rPr>
               <w:t>Recubrimiento correcto, acero protegido y concreto poco permeable</w:t>
@@ -2349,6 +2185,7 @@
             <w:r>
               <w:rPr>
                 <w:b w:val="0"/>
+                <w:i w:val="0"/>
                 <w:sz w:val="19"/>
               </w:rPr>
               <w:t>Subrasante compactada</w:t>
@@ -2364,6 +2201,7 @@
             <w:r>
               <w:rPr>
                 <w:b w:val="0"/>
+                <w:i w:val="0"/>
                 <w:sz w:val="19"/>
               </w:rPr>
               <w:t>30 cm</w:t>
@@ -2379,6 +2217,7 @@
             <w:r>
               <w:rPr>
                 <w:b w:val="0"/>
+                <w:i w:val="0"/>
                 <w:sz w:val="19"/>
               </w:rPr>
               <w:t>95 % Proctor modificado, verificado punto por punto: un suelo parejo</w:t>
@@ -2396,6 +2235,7 @@
             <w:r>
               <w:rPr>
                 <w:b w:val="0"/>
+                <w:i w:val="0"/>
                 <w:sz w:val="19"/>
               </w:rPr>
               <w:t>Subbase drenante + geotextil</w:t>
@@ -2411,6 +2251,7 @@
             <w:r>
               <w:rPr>
                 <w:b w:val="0"/>
+                <w:i w:val="0"/>
                 <w:sz w:val="19"/>
               </w:rPr>
               <w:t>15–20 cm</w:t>
@@ -2426,6 +2267,7 @@
             <w:r>
               <w:rPr>
                 <w:b w:val="0"/>
+                <w:i w:val="0"/>
                 <w:sz w:val="19"/>
               </w:rPr>
               <w:t>Saca el agua; con dren de borde perforado de 10 cm y salidas cada 60–100 m</w:t>
@@ -2443,6 +2285,7 @@
             <w:r>
               <w:rPr>
                 <w:b w:val="0"/>
+                <w:i w:val="0"/>
                 <w:sz w:val="19"/>
               </w:rPr>
               <w:t>Base de concreto pobre</w:t>
@@ -2458,6 +2301,7 @@
             <w:r>
               <w:rPr>
                 <w:b w:val="0"/>
+                <w:i w:val="0"/>
                 <w:sz w:val="19"/>
               </w:rPr>
               <w:t>15–20 cm</w:t>
@@ -2473,6 +2317,7 @@
             <w:r>
               <w:rPr>
                 <w:b w:val="0"/>
+                <w:i w:val="0"/>
                 <w:sz w:val="19"/>
               </w:rPr>
               <w:t>f'c 100–150 kg/cm²: un apoyo que el agua no lava</w:t>
@@ -2490,6 +2335,7 @@
             <w:r>
               <w:rPr>
                 <w:b w:val="0"/>
+                <w:i w:val="0"/>
                 <w:sz w:val="19"/>
               </w:rPr>
               <w:t>Interfaz bituminosa</w:t>
@@ -2505,6 +2351,7 @@
             <w:r>
               <w:rPr>
                 <w:b w:val="0"/>
+                <w:i w:val="0"/>
                 <w:sz w:val="19"/>
               </w:rPr>
               <w:t>4–6 cm</w:t>
@@ -2520,6 +2367,7 @@
             <w:r>
               <w:rPr>
                 <w:b w:val="0"/>
+                <w:i w:val="0"/>
                 <w:sz w:val="19"/>
               </w:rPr>
               <w:t>Deja que la losa se encoja sin agrietarse</w:t>
@@ -2537,6 +2385,7 @@
             <w:r>
               <w:rPr>
                 <w:b w:val="0"/>
+                <w:i w:val="0"/>
                 <w:sz w:val="19"/>
               </w:rPr>
               <w:t>Losa de concreto reforzado continuo (CRCP)</w:t>
@@ -2552,6 +2401,7 @@
             <w:r>
               <w:rPr>
                 <w:b w:val="0"/>
+                <w:i w:val="0"/>
                 <w:sz w:val="19"/>
               </w:rPr>
               <w:t>27 cm</w:t>
@@ -2567,6 +2417,7 @@
             <w:r>
               <w:rPr>
                 <w:b w:val="0"/>
+                <w:i w:val="0"/>
                 <w:sz w:val="19"/>
               </w:rPr>
               <w:t>Sin juntas; acero #6 cada 15 cm a un tercio del espesor; carril colado de 4.20 m con la raya a 3.60 m y hombro de concreto amarrado</w:t>
@@ -3002,6 +2853,7 @@
             <w:r>
               <w:rPr>
                 <w:b w:val="0"/>
+                <w:i w:val="0"/>
                 <w:sz w:val="19"/>
               </w:rPr>
               <w:t>Día 1</w:t>
@@ -3017,6 +2869,7 @@
             <w:r>
               <w:rPr>
                 <w:b w:val="0"/>
+                <w:i w:val="0"/>
                 <w:sz w:val="19"/>
               </w:rPr>
               <w:t>Inducción con Seguridad e higiene y tu jefe directo: por qué construimos así (el manifiesto), las cinco enfermedades y las tres reglas, las reglas de autoridad, el equipo de protección, el recorrido completo del frente de noche y de día, y la entrega de este documento. Alta en el IMSS y en el seguro médico desde este día.</w:t>
@@ -3034,6 +2887,7 @@
             <w:r>
               <w:rPr>
                 <w:b w:val="0"/>
+                <w:i w:val="0"/>
                 <w:sz w:val="19"/>
               </w:rPr>
               <w:t>Semana 1</w:t>
@@ -3049,6 +2903,7 @@
             <w:r>
               <w:rPr>
                 <w:b w:val="0"/>
+                <w:i w:val="0"/>
                 <w:sz w:val="19"/>
               </w:rPr>
               <w:t>Lectura completa de la especificación y del modelo de negocio; recorrido de todos los frentes y del tramo de prueba con el Gerente de calidad.</w:t>
@@ -3066,6 +2921,7 @@
             <w:r>
               <w:rPr>
                 <w:b w:val="0"/>
+                <w:i w:val="0"/>
                 <w:sz w:val="19"/>
               </w:rPr>
               <w:t>Semanas 2 a 4</w:t>
@@ -3081,6 +2937,7 @@
             <w:r>
               <w:rPr>
                 <w:b w:val="0"/>
+                <w:i w:val="0"/>
                 <w:sz w:val="19"/>
               </w:rPr>
               <w:t>Una noche completa en cada puesto crítico del tren (planta, despacho, laboratorio, pavimentadora). Revisión del contrato con el área jurídica y del cotizador con administración.</w:t>
@@ -3098,6 +2955,7 @@
             <w:r>
               <w:rPr>
                 <w:b w:val="0"/>
+                <w:i w:val="0"/>
                 <w:sz w:val="19"/>
               </w:rPr>
               <w:t>Tramo de prueba</w:t>
@@ -3113,6 +2971,7 @@
             <w:r>
               <w:rPr>
                 <w:b w:val="0"/>
+                <w:i w:val="0"/>
                 <w:sz w:val="19"/>
               </w:rPr>
               <w:t>Dirige la evaluación de las tres variantes y la decisión de cuál se escala, con datos del laboratorio.</w:t>
@@ -3130,6 +2989,7 @@
             <w:r>
               <w:rPr>
                 <w:b w:val="0"/>
+                <w:i w:val="0"/>
                 <w:sz w:val="19"/>
               </w:rPr>
               <w:t>Primer año</w:t>
@@ -3145,6 +3005,7 @@
             <w:r>
               <w:rPr>
                 <w:b w:val="0"/>
+                <w:i w:val="0"/>
                 <w:sz w:val="19"/>
               </w:rPr>
               <w:t>Revisión trimestral con la dirección general: tablero, margen, gente y cliente.</w:t>
@@ -3323,7 +3184,7 @@
         <w:pStyle w:val="Heading1"/>
       </w:pPr>
       <w:r>
-        <w:t>Parte 4 · Lo que te prometemos y lo que te pedimos</w:t>
+        <w:t>Parte 4 · Tu KPI, tu sueldo y cómo se te mide</w:t>
       </w:r>
     </w:p>
     <w:p>
@@ -3331,179 +3192,7 @@
         <w:pStyle w:val="Heading2"/>
       </w:pPr>
       <w:r>
-        <w:t>Lo que te prometemos</w:t>
-      </w:r>
-    </w:p>
-    <w:p>
-      <w:pPr>
-        <w:pStyle w:val="ListBullet"/>
-      </w:pPr>
-      <w:r>
-        <w:rPr>
-          <w:b w:val="0"/>
-          <w:i w:val="0"/>
-        </w:rPr>
-        <w:t>Tu pago, siempre el mismo día, con un recibo claro. Tu variable del mes se ve al día en el tablero: sabes cuánto llevas ganado.</w:t>
-      </w:r>
-    </w:p>
-    <w:p>
-      <w:pPr>
-        <w:pStyle w:val="ListBullet"/>
-      </w:pPr>
-      <w:r>
-        <w:rPr>
-          <w:b w:val="0"/>
-          <w:i w:val="0"/>
-        </w:rPr>
-        <w:t>Turnos publicados con dos semanas de anticipación. Ciclos de 12 días de trabajo y 4 de descanso, con transporte pagado a casa. Nunca se dobla turno; la noche lleva 20 % de prima.</w:t>
-      </w:r>
-    </w:p>
-    <w:p>
-      <w:pPr>
-        <w:pStyle w:val="ListBullet"/>
-      </w:pPr>
-      <w:r>
-        <w:rPr>
-          <w:b w:val="0"/>
-          <w:i w:val="0"/>
-        </w:rPr>
-        <w:t>Campamento digno: habitaciones de máximo dos personas, aire acondicionado, internet y lavandería. Tres comidas calientes al día, incluida la de medianoche. Sombra e hidratación en el frente.</w:t>
-      </w:r>
-    </w:p>
-    <w:p>
-      <w:pPr>
-        <w:pStyle w:val="ListBullet"/>
-      </w:pPr>
-      <w:r>
-        <w:rPr>
-          <w:b w:val="0"/>
-          <w:i w:val="0"/>
-        </w:rPr>
-        <w:t>IMSS completo desde el primer día y seguro de gastos médicos mayores para todos. Chequeo médico al entrar y cada seis meses.</w:t>
-      </w:r>
-    </w:p>
-    <w:p>
-      <w:pPr>
-        <w:pStyle w:val="ListBullet"/>
-      </w:pPr>
-      <w:r>
-        <w:rPr>
-          <w:b w:val="0"/>
-          <w:i w:val="0"/>
-        </w:rPr>
-        <w:t>Capacitación pagada y certificaciones que te llevas puestas. Una escalera de crecimiento escrita, con sus requisitos. Si enseñas, cobras un bono por enseñar.</w:t>
-      </w:r>
-    </w:p>
-    <w:p>
-      <w:pPr>
-        <w:pStyle w:val="ListBullet"/>
-      </w:pPr>
-      <w:r>
-        <w:rPr>
-          <w:b w:val="0"/>
-          <w:i w:val="0"/>
-        </w:rPr>
-        <w:t>Fondo de ahorro con aportación igual de la empresa y reparto de utilidades de ley.</w:t>
-      </w:r>
-    </w:p>
-    <w:p>
-      <w:pPr>
-        <w:pStyle w:val="ListBullet"/>
-      </w:pPr>
-      <w:r>
-        <w:rPr>
-          <w:b w:val="0"/>
-          <w:i w:val="0"/>
-        </w:rPr>
-        <w:t>Continuidad: contratos de varios años y prioridad en el siguiente corredor. Y una placa con el nombre de tu cuadrilla en cada tramo que entreguemos.</w:t>
-      </w:r>
-    </w:p>
-    <w:p>
-      <w:pPr>
-        <w:pStyle w:val="Heading2"/>
-      </w:pPr>
-      <w:r>
-        <w:t>Lo que te pedimos</w:t>
-      </w:r>
-    </w:p>
-    <w:p>
-      <w:pPr>
-        <w:pStyle w:val="ListBullet"/>
-      </w:pPr>
-      <w:r>
-        <w:rPr>
-          <w:b w:val="0"/>
-          <w:i w:val="0"/>
-        </w:rPr>
-        <w:t>Llegar a tiempo y en condiciones: descansado, sin alcohol ni sustancias. Un frente nocturno no perdona el cansancio.</w:t>
-      </w:r>
-    </w:p>
-    <w:p>
-      <w:pPr>
-        <w:pStyle w:val="ListBullet"/>
-      </w:pPr>
-      <w:r>
-        <w:rPr>
-          <w:b w:val="0"/>
-          <w:i w:val="0"/>
-        </w:rPr>
-        <w:t>Decir la verdad en el tablero y en la junta, sobre todo cuando la noticia es mala. Un problema dicho a tiempo cuesta minutos; escondido, cuesta semanas.</w:t>
-      </w:r>
-    </w:p>
-    <w:p>
-      <w:pPr>
-        <w:pStyle w:val="ListBullet"/>
-      </w:pPr>
-      <w:r>
-        <w:rPr>
-          <w:b w:val="0"/>
-          <w:i w:val="0"/>
-        </w:rPr>
-        <w:t>Parar cuando algo está mal. Nadie te va a reclamar por detener el trabajo por seguridad o por calidad.</w:t>
-      </w:r>
-    </w:p>
-    <w:p>
-      <w:pPr>
-        <w:pStyle w:val="ListBullet"/>
-      </w:pPr>
-      <w:r>
-        <w:rPr>
-          <w:b w:val="0"/>
-          <w:i w:val="0"/>
-        </w:rPr>
-        <w:t>Nunca añadir agua al concreto, ni permitir que otro lo haga.</w:t>
-      </w:r>
-    </w:p>
-    <w:p>
-      <w:pPr>
-        <w:pStyle w:val="ListBullet"/>
-      </w:pPr>
-      <w:r>
-        <w:rPr>
-          <w:b w:val="0"/>
-          <w:i w:val="0"/>
-        </w:rPr>
-        <w:t>Cuidar al de al lado: su seguridad, su trabajo y su aprendizaje.</w:t>
-      </w:r>
-    </w:p>
-    <w:p>
-      <w:pPr>
-        <w:pStyle w:val="ListBullet"/>
-      </w:pPr>
-      <w:r>
-        <w:rPr>
-          <w:b w:val="0"/>
-          <w:i w:val="0"/>
-        </w:rPr>
-        <w:t>Aprender, y cuando ya sepas, enseñar.</w:t>
-      </w:r>
-    </w:p>
-    <w:p>
-      <w:pPr>
-        <w:pStyle w:val="Heading2"/>
-      </w:pPr>
-      <w:r>
-        <w:t>Constancia de lectura</w:t>
+        <w:t>Tu KPI principal</w:t>
       </w:r>
     </w:p>
     <w:p>
@@ -3512,7 +3201,644 @@
           <w:b w:val="0"/>
           <w:i w:val="0"/>
         </w:rPr>
-        <w:t xml:space="preserve">Leí completo este documento del puesto </w:t>
+        <w:t>Es el número que dice, antes que ningún otro, si tu puesto se está haciendo bien. Lo ves en el tablero todos los días, igual que tu jefe.</w:t>
+      </w:r>
+    </w:p>
+    <w:tbl>
+      <w:tblPr>
+        <w:tblStyle w:val="TableGrid"/>
+        <w:tblW w:type="auto" w:w="0"/>
+        <w:jc w:val="center"/>
+        <w:tblLook w:firstColumn="1" w:firstRow="1" w:lastColumn="0" w:lastRow="0" w:noHBand="0" w:noVBand="1" w:val="04A0"/>
+      </w:tblPr>
+      <w:tblGrid>
+        <w:gridCol w:w="4873"/>
+        <w:gridCol w:w="4873"/>
+      </w:tblGrid>
+      <w:tr>
+        <w:tc>
+          <w:tcPr>
+            <w:tcW w:type="dxa" w:w="2551"/>
+            <w:shd w:val="clear" w:color="auto" w:fill="0B7A55"/>
+          </w:tcPr>
+          <w:p>
+            <w:r/>
+            <w:r>
+              <w:rPr>
+                <w:b/>
+                <w:color w:val="FFFFFF"/>
+                <w:sz w:val="19"/>
+              </w:rPr>
+              <w:t>KPI principal</w:t>
+            </w:r>
+          </w:p>
+        </w:tc>
+        <w:tc>
+          <w:tcPr>
+            <w:tcW w:type="dxa" w:w="7087"/>
+            <w:shd w:val="clear" w:color="auto" w:fill="0B7A55"/>
+          </w:tcPr>
+          <w:p>
+            <w:r/>
+            <w:r>
+              <w:rPr>
+                <w:b/>
+                <w:color w:val="FFFFFF"/>
+                <w:sz w:val="19"/>
+              </w:rPr>
+              <w:t>Km-carril aceptados contra programa</w:t>
+            </w:r>
+          </w:p>
+        </w:tc>
+      </w:tr>
+      <w:tr>
+        <w:tc>
+          <w:tcPr>
+            <w:tcW w:type="dxa" w:w="2551"/>
+          </w:tcPr>
+          <w:p>
+            <w:r/>
+            <w:r>
+              <w:rPr>
+                <w:b w:val="0"/>
+                <w:i w:val="0"/>
+                <w:sz w:val="19"/>
+              </w:rPr>
+              <w:t>Meta</w:t>
+            </w:r>
+          </w:p>
+        </w:tc>
+        <w:tc>
+          <w:tcPr>
+            <w:tcW w:type="dxa" w:w="7087"/>
+          </w:tcPr>
+          <w:p>
+            <w:r/>
+            <w:r>
+              <w:rPr>
+                <w:b w:val="0"/>
+                <w:i w:val="0"/>
+                <w:sz w:val="19"/>
+              </w:rPr>
+              <w:t>100 % del programa trimestral, con cero desviaciones sin firma y núcleos, IRI y permeabilidad dentro de especificación</w:t>
+            </w:r>
+          </w:p>
+        </w:tc>
+      </w:tr>
+      <w:tr>
+        <w:tc>
+          <w:tcPr>
+            <w:tcW w:type="dxa" w:w="2551"/>
+          </w:tcPr>
+          <w:p>
+            <w:r/>
+            <w:r>
+              <w:rPr>
+                <w:b w:val="0"/>
+                <w:i w:val="0"/>
+                <w:sz w:val="19"/>
+              </w:rPr>
+              <w:t>Cómo y quién lo mide</w:t>
+            </w:r>
+          </w:p>
+        </w:tc>
+        <w:tc>
+          <w:tcPr>
+            <w:tcW w:type="dxa" w:w="7087"/>
+          </w:tcPr>
+          <w:p>
+            <w:r/>
+            <w:r>
+              <w:rPr>
+                <w:b w:val="0"/>
+                <w:i w:val="0"/>
+                <w:sz w:val="19"/>
+              </w:rPr>
+              <w:t>El Ingeniero de datos cruza metros colados con la aceptación de Calidad en el tablero; lo revisa la Dirección general cada mes y a fondo cada trimestre.</w:t>
+            </w:r>
+          </w:p>
+        </w:tc>
+      </w:tr>
+      <w:tr>
+        <w:tc>
+          <w:tcPr>
+            <w:tcW w:type="dxa" w:w="2551"/>
+          </w:tcPr>
+          <w:p>
+            <w:r/>
+            <w:r>
+              <w:rPr>
+                <w:b w:val="0"/>
+                <w:i w:val="0"/>
+                <w:sz w:val="19"/>
+              </w:rPr>
+              <w:t>Cuándo se enciende la alerta</w:t>
+            </w:r>
+          </w:p>
+        </w:tc>
+        <w:tc>
+          <w:tcPr>
+            <w:tcW w:type="dxa" w:w="7087"/>
+          </w:tcPr>
+          <w:p>
+            <w:r/>
+            <w:r>
+              <w:rPr>
+                <w:b w:val="0"/>
+                <w:i w:val="0"/>
+                <w:sz w:val="19"/>
+              </w:rPr>
+              <w:t>Menos del 90 % del programa aceptado en un trimestre, o una sola desviación encontrada sin firma</w:t>
+            </w:r>
+          </w:p>
+        </w:tc>
+      </w:tr>
+    </w:tbl>
+    <w:p/>
+    <w:p>
+      <w:pPr>
+        <w:pStyle w:val="Heading2"/>
+      </w:pPr>
+      <w:r>
+        <w:t>Tus demás indicadores</w:t>
+      </w:r>
+    </w:p>
+    <w:p>
+      <w:pPr>
+        <w:pStyle w:val="ListBullet"/>
+      </w:pPr>
+      <w:r>
+        <w:rPr>
+          <w:b w:val="0"/>
+          <w:i w:val="0"/>
+        </w:rPr>
+        <w:t>Avance contra programa sin tocar los colchones mínimos.</w:t>
+      </w:r>
+    </w:p>
+    <w:p>
+      <w:pPr>
+        <w:pStyle w:val="ListBullet"/>
+      </w:pPr>
+      <w:r>
+        <w:rPr>
+          <w:b w:val="0"/>
+          <w:i w:val="0"/>
+        </w:rPr>
+        <w:t>Cero desviaciones sin firma; núcleos, IRI y permeabilidad dentro de especificación.</w:t>
+      </w:r>
+    </w:p>
+    <w:p>
+      <w:pPr>
+        <w:pStyle w:val="ListBullet"/>
+      </w:pPr>
+      <w:r>
+        <w:rPr>
+          <w:b w:val="0"/>
+          <w:i w:val="0"/>
+        </w:rPr>
+        <w:t>Margen del proyecto contra presupuesto.</w:t>
+      </w:r>
+    </w:p>
+    <w:p>
+      <w:pPr>
+        <w:pStyle w:val="ListBullet"/>
+      </w:pPr>
+      <w:r>
+        <w:rPr>
+          <w:b w:val="0"/>
+          <w:i w:val="0"/>
+        </w:rPr>
+        <w:t>Cero accidentes graves.</w:t>
+      </w:r>
+    </w:p>
+    <w:p>
+      <w:pPr>
+        <w:pStyle w:val="ListBullet"/>
+      </w:pPr>
+      <w:r>
+        <w:rPr>
+          <w:b w:val="0"/>
+          <w:i w:val="0"/>
+        </w:rPr>
+        <w:t>A los años 2 y 5: suavidad, agrietamiento y drenes del tramo entregado.</w:t>
+      </w:r>
+    </w:p>
+    <w:p>
+      <w:pPr>
+        <w:pStyle w:val="Heading2"/>
+      </w:pPr>
+      <w:r>
+        <w:t>Tu sueldo y tu variable</w:t>
+      </w:r>
+    </w:p>
+    <w:p>
+      <w:r>
+        <w:rPr>
+          <w:b w:val="0"/>
+          <w:i w:val="0"/>
+        </w:rPr>
+        <w:t xml:space="preserve">Sueldo mensual bruto: </w:t>
+      </w:r>
+      <w:r>
+        <w:rPr>
+          <w:rStyle w:val="M_base"/>
+          <w:b/>
+          <w:i w:val="0"/>
+        </w:rPr>
+        <w:t>$230,000</w:t>
+      </w:r>
+      <w:r>
+        <w:rPr>
+          <w:b w:val="0"/>
+          <w:i w:val="0"/>
+        </w:rPr>
+        <w:t xml:space="preserve"> (</w:t>
+      </w:r>
+      <w:r>
+        <w:rPr>
+          <w:rStyle w:val="M_anual"/>
+          <w:b w:val="0"/>
+          <w:i w:val="0"/>
+        </w:rPr>
+        <w:t>$2,760,000</w:t>
+      </w:r>
+      <w:r>
+        <w:rPr>
+          <w:b w:val="0"/>
+          <w:i w:val="0"/>
+        </w:rPr>
+        <w:t xml:space="preserve"> al año), más prestaciones de ley desde el primer día. Variable meta: </w:t>
+      </w:r>
+      <w:r>
+        <w:rPr>
+          <w:rStyle w:val="M_varp"/>
+          <w:b/>
+          <w:i w:val="0"/>
+        </w:rPr>
+        <w:t>30</w:t>
+      </w:r>
+      <w:r>
+        <w:rPr>
+          <w:b/>
+          <w:i w:val="0"/>
+        </w:rPr>
+        <w:t xml:space="preserve"> % del sueldo anual</w:t>
+      </w:r>
+      <w:r>
+        <w:rPr>
+          <w:b w:val="0"/>
+          <w:i w:val="0"/>
+        </w:rPr>
+        <w:t xml:space="preserve"> (</w:t>
+      </w:r>
+      <w:r>
+        <w:rPr>
+          <w:rStyle w:val="M_var"/>
+          <w:b w:val="0"/>
+          <w:i w:val="0"/>
+        </w:rPr>
+        <w:t>$828,000</w:t>
+      </w:r>
+      <w:r>
+        <w:rPr>
+          <w:b w:val="0"/>
+          <w:i w:val="0"/>
+        </w:rPr>
+        <w:t xml:space="preserve">); con la meta cumplida, tu compensación del año suma </w:t>
+      </w:r>
+      <w:r>
+        <w:rPr>
+          <w:rStyle w:val="M_total"/>
+          <w:b/>
+          <w:i w:val="0"/>
+        </w:rPr>
+        <w:t>$3,588,000</w:t>
+      </w:r>
+      <w:r>
+        <w:rPr>
+          <w:b w:val="0"/>
+          <w:i w:val="0"/>
+        </w:rPr>
+        <w:t>.</w:t>
+      </w:r>
+    </w:p>
+    <w:p>
+      <w:r>
+        <w:rPr>
+          <w:b/>
+          <w:i w:val="0"/>
+        </w:rPr>
+        <w:t>Cómo se paga el variable:</w:t>
+      </w:r>
+      <w:r>
+        <w:rPr>
+          <w:b w:val="0"/>
+          <w:i w:val="0"/>
+        </w:rPr>
+        <w:t xml:space="preserve"> cada año, pagado en tres partes.</w:t>
+      </w:r>
+    </w:p>
+    <w:tbl>
+      <w:tblPr>
+        <w:tblStyle w:val="TableGrid"/>
+        <w:tblW w:type="auto" w:w="0"/>
+        <w:jc w:val="center"/>
+        <w:tblLook w:firstColumn="1" w:firstRow="1" w:lastColumn="0" w:lastRow="0" w:noHBand="0" w:noVBand="1" w:val="04A0"/>
+      </w:tblPr>
+      <w:tblGrid>
+        <w:gridCol w:w="4873"/>
+        <w:gridCol w:w="4873"/>
+      </w:tblGrid>
+      <w:tr>
+        <w:tc>
+          <w:tcPr>
+            <w:tcW w:type="dxa" w:w="1417"/>
+            <w:shd w:val="clear" w:color="auto" w:fill="0039C8"/>
+          </w:tcPr>
+          <w:p>
+            <w:r/>
+            <w:r>
+              <w:rPr>
+                <w:b/>
+                <w:color w:val="FFFFFF"/>
+                <w:sz w:val="19"/>
+              </w:rPr>
+              <w:t>Peso</w:t>
+            </w:r>
+          </w:p>
+        </w:tc>
+        <w:tc>
+          <w:tcPr>
+            <w:tcW w:type="dxa" w:w="8220"/>
+            <w:shd w:val="clear" w:color="auto" w:fill="0039C8"/>
+          </w:tcPr>
+          <w:p>
+            <w:r/>
+            <w:r>
+              <w:rPr>
+                <w:b/>
+                <w:color w:val="FFFFFF"/>
+                <w:sz w:val="19"/>
+              </w:rPr>
+              <w:t>Meta</w:t>
+            </w:r>
+          </w:p>
+        </w:tc>
+      </w:tr>
+      <w:tr>
+        <w:tc>
+          <w:tcPr>
+            <w:tcW w:type="dxa" w:w="1417"/>
+          </w:tcPr>
+          <w:p>
+            <w:r/>
+            <w:r>
+              <w:rPr>
+                <w:b w:val="0"/>
+                <w:i w:val="0"/>
+                <w:sz w:val="19"/>
+              </w:rPr>
+              <w:t>40 %</w:t>
+            </w:r>
+          </w:p>
+        </w:tc>
+        <w:tc>
+          <w:tcPr>
+            <w:tcW w:type="dxa" w:w="8220"/>
+          </w:tcPr>
+          <w:p>
+            <w:r/>
+            <w:r>
+              <w:rPr>
+                <w:b w:val="0"/>
+                <w:i w:val="0"/>
+                <w:sz w:val="19"/>
+              </w:rPr>
+              <w:t>Al entregar el tramo</w:t>
+            </w:r>
+          </w:p>
+        </w:tc>
+      </w:tr>
+      <w:tr>
+        <w:tc>
+          <w:tcPr>
+            <w:tcW w:type="dxa" w:w="1417"/>
+          </w:tcPr>
+          <w:p>
+            <w:r/>
+            <w:r>
+              <w:rPr>
+                <w:b w:val="0"/>
+                <w:i w:val="0"/>
+                <w:sz w:val="19"/>
+              </w:rPr>
+              <w:t>30 %</w:t>
+            </w:r>
+          </w:p>
+        </w:tc>
+        <w:tc>
+          <w:tcPr>
+            <w:tcW w:type="dxa" w:w="8220"/>
+          </w:tcPr>
+          <w:p>
+            <w:r/>
+            <w:r>
+              <w:rPr>
+                <w:b w:val="0"/>
+                <w:i w:val="0"/>
+                <w:sz w:val="19"/>
+              </w:rPr>
+              <w:t>Al año 2, si el tramo cumple</w:t>
+            </w:r>
+          </w:p>
+        </w:tc>
+      </w:tr>
+      <w:tr>
+        <w:tc>
+          <w:tcPr>
+            <w:tcW w:type="dxa" w:w="1417"/>
+          </w:tcPr>
+          <w:p>
+            <w:r/>
+            <w:r>
+              <w:rPr>
+                <w:b w:val="0"/>
+                <w:i w:val="0"/>
+                <w:sz w:val="19"/>
+              </w:rPr>
+              <w:t>30 %</w:t>
+            </w:r>
+          </w:p>
+        </w:tc>
+        <w:tc>
+          <w:tcPr>
+            <w:tcW w:type="dxa" w:w="8220"/>
+          </w:tcPr>
+          <w:p>
+            <w:r/>
+            <w:r>
+              <w:rPr>
+                <w:b w:val="0"/>
+                <w:i w:val="0"/>
+                <w:sz w:val="19"/>
+              </w:rPr>
+              <w:t>Al año 5, si el tramo sigue cumpliendo la garantía (suavidad, agrietamiento, drenes)</w:t>
+            </w:r>
+          </w:p>
+        </w:tc>
+      </w:tr>
+    </w:tbl>
+    <w:p/>
+    <w:p>
+      <w:pPr>
+        <w:spacing w:before="120"/>
+        <w:ind w:left="340"/>
+      </w:pPr>
+      <w:r>
+        <w:rPr>
+          <w:b/>
+          <w:i w:val="0"/>
+          <w:color w:val="A86A00"/>
+          <w:sz w:val="23"/>
+        </w:rPr>
+        <w:t>Cobras cuando la carretera demuestra que dura.</w:t>
+      </w:r>
+    </w:p>
+    <w:p>
+      <w:pPr>
+        <w:pStyle w:val="Heading2"/>
+      </w:pPr>
+      <w:r>
+        <w:t>Si no llegas a tu KPI</w:t>
+      </w:r>
+    </w:p>
+    <w:p>
+      <w:pPr>
+        <w:pStyle w:val="ListBullet"/>
+      </w:pPr>
+      <w:r>
+        <w:rPr>
+          <w:b w:val="0"/>
+          <w:i w:val="0"/>
+        </w:rPr>
+        <w:t>Cuando tu KPI entra en alerta (menos del 90 % del programa aceptado en un trimestre, o una sola desviación encontrada sin firma), tu jefe directo habla contigo esa misma semana: qué pasó, qué necesitas y qué va a cambiar. Queda por escrito.</w:t>
+      </w:r>
+    </w:p>
+    <w:p>
+      <w:pPr>
+        <w:pStyle w:val="ListBullet"/>
+      </w:pPr>
+      <w:r>
+        <w:rPr>
+          <w:b w:val="0"/>
+          <w:i w:val="0"/>
+        </w:rPr>
+        <w:t xml:space="preserve">Si en el mes siguiente sigue en alerta, se abre un </w:t>
+      </w:r>
+      <w:r>
+        <w:rPr>
+          <w:b/>
+          <w:i w:val="0"/>
+        </w:rPr>
+        <w:t>plan de mejora de 30 días</w:t>
+      </w:r>
+      <w:r>
+        <w:rPr>
+          <w:b w:val="0"/>
+          <w:i w:val="0"/>
+        </w:rPr>
+        <w:t>: una meta semanal, capacitación adicional y alguien que te acompañe. Lo firman tú y tu jefe.</w:t>
+      </w:r>
+    </w:p>
+    <w:p>
+      <w:pPr>
+        <w:pStyle w:val="ListBullet"/>
+      </w:pPr>
+      <w:r>
+        <w:rPr>
+          <w:b w:val="0"/>
+          <w:i w:val="0"/>
+        </w:rPr>
+        <w:t xml:space="preserve">Si al terminar el plan no se recupera, te podemos proponer otro puesto donde rindas mejor. Si no hay acuerdo, la relación de trabajo se termina </w:t>
+      </w:r>
+      <w:r>
+        <w:rPr>
+          <w:b/>
+          <w:i w:val="0"/>
+        </w:rPr>
+        <w:t>con la indemnización completa que marca la ley</w:t>
+      </w:r>
+      <w:r>
+        <w:rPr>
+          <w:b w:val="0"/>
+          <w:i w:val="0"/>
+        </w:rPr>
+        <w:t>.</w:t>
+      </w:r>
+    </w:p>
+    <w:p>
+      <w:pPr>
+        <w:pStyle w:val="ListBullet"/>
+      </w:pPr>
+      <w:r>
+        <w:rPr>
+          <w:b w:val="0"/>
+          <w:i w:val="0"/>
+        </w:rPr>
+        <w:t xml:space="preserve">El bajo desempeño </w:t>
+      </w:r>
+      <w:r>
+        <w:rPr>
+          <w:b/>
+          <w:i w:val="0"/>
+        </w:rPr>
+        <w:t>nunca</w:t>
+      </w:r>
+      <w:r>
+        <w:rPr>
+          <w:b w:val="0"/>
+          <w:i w:val="0"/>
+        </w:rPr>
+        <w:t xml:space="preserve"> es despido sin indemnización. Tampoco lo es un mal número cuya causa no depende de ti (una falla de planta, una lluvia, un predio sin liberar): eso lo aclara el tablero.</w:t>
+      </w:r>
+    </w:p>
+    <w:p>
+      <w:r>
+        <w:br w:type="page"/>
+      </w:r>
+    </w:p>
+    <w:p>
+      <w:pPr>
+        <w:pStyle w:val="Heading1"/>
+      </w:pPr>
+      <w:r>
+        <w:t>Parte 5 · Motivos de despido</w:t>
+      </w:r>
+    </w:p>
+    <w:p>
+      <w:r>
+        <w:rPr>
+          <w:b w:val="0"/>
+          <w:i w:val="0"/>
+        </w:rPr>
+        <w:t>Aquí nadie se entera de las reglas el día que lo despiden. Esta es la lista completa y exacta. Si algo no está aquí ni en la ley, no es motivo de despido.</w:t>
+      </w:r>
+    </w:p>
+    <w:p>
+      <w:pPr>
+        <w:pStyle w:val="Heading2"/>
+      </w:pPr>
+      <w:r>
+        <w:t>En tu puesto</w:t>
+      </w:r>
+    </w:p>
+    <w:p>
+      <w:r>
+        <w:rPr>
+          <w:b w:val="0"/>
+          <w:i w:val="0"/>
+        </w:rPr>
+        <w:t xml:space="preserve">Estas conductas, propias del puesto de </w:t>
       </w:r>
       <w:r>
         <w:rPr>
@@ -3526,10 +3852,949 @@
           <w:b w:val="0"/>
           <w:i w:val="0"/>
         </w:rPr>
-        <w:t>, lo entendí y resolví mis dudas con mi jefe directo. Sé que puedo detener el trabajo por seguridad sin consecuencias, que en esta obra nunca se añade agua al concreto y que las desviaciones sólo existen si están firmadas.</w:t>
+        <w:t>, son falta grave y causa de despido sin responsabilidad para la empresa:</w:t>
       </w:r>
     </w:p>
-    <w:p/>
+    <w:p>
+      <w:pPr>
+        <w:pStyle w:val="ListBullet"/>
+      </w:pPr>
+      <w:r>
+        <w:rPr>
+          <w:b w:val="0"/>
+          <w:i w:val="0"/>
+        </w:rPr>
+        <w:t>Reanudar un colado detenido por Calidad o por Seguridad sin dejar por escrito la causa y qué cambió.</w:t>
+      </w:r>
+    </w:p>
+    <w:p>
+      <w:pPr>
+        <w:pStyle w:val="ListBullet"/>
+      </w:pPr>
+      <w:r>
+        <w:rPr>
+          <w:b w:val="0"/>
+          <w:i w:val="0"/>
+        </w:rPr>
+        <w:t>Autorizar de palabra, o permitir que se aplique sin su firma, una desviación de la especificación (espesor, agua/cementante, curado o drenaje).</w:t>
+      </w:r>
+    </w:p>
+    <w:p>
+      <w:pPr>
+        <w:pStyle w:val="ListBullet"/>
+      </w:pPr>
+      <w:r>
+        <w:rPr>
+          <w:b w:val="0"/>
+          <w:i w:val="0"/>
+        </w:rPr>
+        <w:t>Ordenar o consentir que se cambie un dato del tablero, un ensayo o un reporte al cliente para que el avance o la calidad "se vean mejor".</w:t>
+      </w:r>
+    </w:p>
+    <w:p>
+      <w:pPr>
+        <w:pStyle w:val="ListBullet"/>
+      </w:pPr>
+      <w:r>
+        <w:rPr>
+          <w:b w:val="0"/>
+          <w:i w:val="0"/>
+        </w:rPr>
+        <w:t>Remover, castigar o presionar al Gerente de calidad, a un laboratorista o a Seguridad por haber detenido el trabajo.</w:t>
+      </w:r>
+    </w:p>
+    <w:p>
+      <w:pPr>
+        <w:pStyle w:val="ListBullet"/>
+      </w:pPr>
+      <w:r>
+        <w:rPr>
+          <w:b w:val="0"/>
+          <w:i w:val="0"/>
+        </w:rPr>
+        <w:t>Firmar un contrato o un precio por debajo del piso del cotizador sin la autorización escrita de la Dirección general.</w:t>
+      </w:r>
+    </w:p>
+    <w:p>
+      <w:pPr>
+        <w:pStyle w:val="Heading2"/>
+      </w:pPr>
+      <w:r>
+        <w:t>En toda la obra</w:t>
+      </w:r>
+    </w:p>
+    <w:p>
+      <w:r>
+        <w:rPr>
+          <w:b w:val="0"/>
+          <w:i w:val="0"/>
+        </w:rPr>
+        <w:t>Aplican a todos, del Director al ayudante:</w:t>
+      </w:r>
+    </w:p>
+    <w:p>
+      <w:pPr>
+        <w:pStyle w:val="ListBullet"/>
+      </w:pPr>
+      <w:r>
+        <w:rPr>
+          <w:b/>
+          <w:i w:val="0"/>
+        </w:rPr>
+        <w:t>Añadir agua al concreto</w:t>
+      </w:r>
+      <w:r>
+        <w:rPr>
+          <w:b w:val="0"/>
+          <w:i w:val="0"/>
+        </w:rPr>
+        <w:t xml:space="preserve"> en el frente, o pedir, permitir o esconder que otro lo haga.</w:t>
+      </w:r>
+    </w:p>
+    <w:p>
+      <w:pPr>
+        <w:pStyle w:val="ListBullet"/>
+      </w:pPr>
+      <w:r>
+        <w:rPr>
+          <w:b/>
+          <w:i w:val="0"/>
+        </w:rPr>
+        <w:t>Falsear un registro:</w:t>
+      </w:r>
+      <w:r>
+        <w:rPr>
+          <w:b w:val="0"/>
+          <w:i w:val="0"/>
+        </w:rPr>
+        <w:t xml:space="preserve"> anotar un dato que no se midió, cambiar uno ya anotado, firmar algo que no se revisó o borrar información del tablero, de la planta o del laboratorio.</w:t>
+      </w:r>
+    </w:p>
+    <w:p>
+      <w:pPr>
+        <w:pStyle w:val="ListBullet"/>
+      </w:pPr>
+      <w:r>
+        <w:rPr>
+          <w:b/>
+          <w:i w:val="0"/>
+        </w:rPr>
+        <w:t>Tomar represalias</w:t>
+      </w:r>
+      <w:r>
+        <w:rPr>
+          <w:b w:val="0"/>
+          <w:i w:val="0"/>
+        </w:rPr>
+        <w:t xml:space="preserve"> —amenazar, castigar, cambiar de turno o presionar— contra alguien que detuvo el trabajo por seguridad o por calidad, o que reportó un error o un casi-accidente.</w:t>
+      </w:r>
+    </w:p>
+    <w:p>
+      <w:pPr>
+        <w:pStyle w:val="ListBullet"/>
+      </w:pPr>
+      <w:r>
+        <w:rPr>
+          <w:b/>
+          <w:i w:val="0"/>
+        </w:rPr>
+        <w:t>Desactivar, quitar o puentear un dispositivo de seguridad</w:t>
+      </w:r>
+      <w:r>
+        <w:rPr>
+          <w:b w:val="0"/>
+          <w:i w:val="0"/>
+        </w:rPr>
+        <w:t>: alarmas de reversa, paros de emergencia, guardas, torretas, sensores o conos del plan de tránsito.</w:t>
+      </w:r>
+    </w:p>
+    <w:p>
+      <w:pPr>
+        <w:pStyle w:val="ListBullet"/>
+      </w:pPr>
+      <w:r>
+        <w:rPr>
+          <w:b/>
+          <w:i w:val="0"/>
+        </w:rPr>
+        <w:t>Ocultar un accidente</w:t>
+      </w:r>
+      <w:r>
+        <w:rPr>
+          <w:b w:val="0"/>
+          <w:i w:val="0"/>
+        </w:rPr>
+        <w:t>, una lesión o un daño a terceros, o pedirle a alguien que no lo reporte.</w:t>
+      </w:r>
+    </w:p>
+    <w:p>
+      <w:pPr>
+        <w:pStyle w:val="ListBullet"/>
+      </w:pPr>
+      <w:r>
+        <w:rPr>
+          <w:b/>
+          <w:i w:val="0"/>
+        </w:rPr>
+        <w:t>Operar una máquina o manejar un vehículo</w:t>
+      </w:r>
+      <w:r>
+        <w:rPr>
+          <w:b w:val="0"/>
+          <w:i w:val="0"/>
+        </w:rPr>
+        <w:t xml:space="preserve"> sin la autorización o la licencia que pide este documento, o prestarle tu máquina a quien no la tiene.</w:t>
+      </w:r>
+    </w:p>
+    <w:p>
+      <w:pPr>
+        <w:pStyle w:val="ListBullet"/>
+      </w:pPr>
+      <w:r>
+        <w:rPr>
+          <w:b/>
+          <w:i w:val="0"/>
+        </w:rPr>
+        <w:t>Seguir colando o trabajando después de que Calidad o Seguridad detuvo</w:t>
+      </w:r>
+      <w:r>
+        <w:rPr>
+          <w:b w:val="0"/>
+          <w:i w:val="0"/>
+        </w:rPr>
+        <w:t>, o reanudar sin la autorización escrita del Director de Proyecto.</w:t>
+      </w:r>
+    </w:p>
+    <w:p>
+      <w:pPr>
+        <w:pStyle w:val="ListBullet"/>
+      </w:pPr>
+      <w:r>
+        <w:rPr>
+          <w:b/>
+          <w:i w:val="0"/>
+        </w:rPr>
+        <w:t>Aceptar o pedir dinero, regalos o favores</w:t>
+      </w:r>
+      <w:r>
+        <w:rPr>
+          <w:b w:val="0"/>
+          <w:i w:val="0"/>
+        </w:rPr>
+        <w:t xml:space="preserve"> de proveedores, transportistas, subcontratistas o vecinos a cambio de algo de la obra.</w:t>
+      </w:r>
+    </w:p>
+    <w:p>
+      <w:pPr>
+        <w:pStyle w:val="Heading2"/>
+      </w:pPr>
+      <w:r>
+        <w:t>Los que marca la ley</w:t>
+      </w:r>
+    </w:p>
+    <w:p>
+      <w:r>
+        <w:rPr>
+          <w:b w:val="0"/>
+          <w:i w:val="0"/>
+        </w:rPr>
+        <w:t>Las causas del artículo 47 de la Ley Federal del Trabajo, dichas en palabras simples:</w:t>
+      </w:r>
+    </w:p>
+    <w:p>
+      <w:pPr>
+        <w:pStyle w:val="ListBullet"/>
+      </w:pPr>
+      <w:r>
+        <w:rPr>
+          <w:b w:val="0"/>
+          <w:i w:val="0"/>
+        </w:rPr>
+        <w:t>Engañar a la empresa al contratarte con documentos, referencias o capacidades falsas (se puede aplicar dentro de los primeros 30 días).</w:t>
+      </w:r>
+    </w:p>
+    <w:p>
+      <w:pPr>
+        <w:pStyle w:val="ListBullet"/>
+      </w:pPr>
+      <w:r>
+        <w:rPr>
+          <w:b w:val="0"/>
+          <w:i w:val="0"/>
+        </w:rPr>
+        <w:t>Faltas de honradez, violencia, amenazas, insultos o malos tratos contra la empresa, sus directivos, sus familias o tus compañeros.</w:t>
+      </w:r>
+    </w:p>
+    <w:p>
+      <w:pPr>
+        <w:pStyle w:val="ListBullet"/>
+      </w:pPr>
+      <w:r>
+        <w:rPr>
+          <w:b w:val="0"/>
+          <w:i w:val="0"/>
+        </w:rPr>
+        <w:t>Dañar a propósito máquinas, herramientas, materiales u obra; o dañarlos gravemente por un descuido tan grande que sea la única causa.</w:t>
+      </w:r>
+    </w:p>
+    <w:p>
+      <w:pPr>
+        <w:pStyle w:val="ListBullet"/>
+      </w:pPr>
+      <w:r>
+        <w:rPr>
+          <w:b w:val="0"/>
+          <w:i w:val="0"/>
+        </w:rPr>
+        <w:t>Poner en peligro, por imprudencia o descuido que no tiene disculpa, la seguridad de la obra o de las personas que están en ella.</w:t>
+      </w:r>
+    </w:p>
+    <w:p>
+      <w:pPr>
+        <w:pStyle w:val="ListBullet"/>
+      </w:pPr>
+      <w:r>
+        <w:rPr>
+          <w:b w:val="0"/>
+          <w:i w:val="0"/>
+        </w:rPr>
+        <w:t>Actos inmorales, hostigamiento o acoso sexual contra cualquier persona en el trabajo.</w:t>
+      </w:r>
+    </w:p>
+    <w:p>
+      <w:pPr>
+        <w:pStyle w:val="ListBullet"/>
+      </w:pPr>
+      <w:r>
+        <w:rPr>
+          <w:b w:val="0"/>
+          <w:i w:val="0"/>
+        </w:rPr>
+        <w:t>Revelar información reservada de la empresa que perjudique a la empresa.</w:t>
+      </w:r>
+    </w:p>
+    <w:p>
+      <w:pPr>
+        <w:pStyle w:val="ListBullet"/>
+      </w:pPr>
+      <w:r>
+        <w:rPr>
+          <w:b w:val="0"/>
+          <w:i w:val="0"/>
+        </w:rPr>
+        <w:t>Más de tres faltas de asistencia en 30 días sin permiso ni causa justificada.</w:t>
+      </w:r>
+    </w:p>
+    <w:p>
+      <w:pPr>
+        <w:pStyle w:val="ListBullet"/>
+      </w:pPr>
+      <w:r>
+        <w:rPr>
+          <w:b w:val="0"/>
+          <w:i w:val="0"/>
+        </w:rPr>
+        <w:t>Desobedecer, sin causa justificada, a la empresa o a tu jefe en el trabajo para el que te contrataron.</w:t>
+      </w:r>
+    </w:p>
+    <w:p>
+      <w:pPr>
+        <w:pStyle w:val="ListBullet"/>
+      </w:pPr>
+      <w:r>
+        <w:rPr>
+          <w:b w:val="0"/>
+          <w:i w:val="0"/>
+        </w:rPr>
+        <w:t>Negarte a usar el equipo de protección o a seguir los procedimientos para evitar accidentes y enfermedades.</w:t>
+      </w:r>
+    </w:p>
+    <w:p>
+      <w:pPr>
+        <w:pStyle w:val="ListBullet"/>
+      </w:pPr>
+      <w:r>
+        <w:rPr>
+          <w:b w:val="0"/>
+          <w:i w:val="0"/>
+        </w:rPr>
+        <w:t>Llegar o trabajar en estado de ebriedad o bajo el efecto de drogas (salvo medicamento con receta, avisando antes de empezar el turno).</w:t>
+      </w:r>
+    </w:p>
+    <w:p>
+      <w:pPr>
+        <w:pStyle w:val="ListBullet"/>
+      </w:pPr>
+      <w:r>
+        <w:rPr>
+          <w:b w:val="0"/>
+          <w:i w:val="0"/>
+        </w:rPr>
+        <w:t>Una sentencia de prisión que te impida trabajar, o dejar de tener, por tu causa, un documento que la ley exige para tu puesto (por ejemplo, la licencia federal).</w:t>
+      </w:r>
+    </w:p>
+    <w:p>
+      <w:pPr>
+        <w:pStyle w:val="ListBullet"/>
+      </w:pPr>
+      <w:r>
+        <w:rPr>
+          <w:b w:val="0"/>
+          <w:i w:val="0"/>
+        </w:rPr>
+        <w:t>Otras faltas de la misma gravedad que las anteriores.</w:t>
+      </w:r>
+    </w:p>
+    <w:p>
+      <w:pPr>
+        <w:pStyle w:val="Heading2"/>
+      </w:pPr>
+      <w:r>
+        <w:t>Lo que nunca es motivo de despido</w:t>
+      </w:r>
+    </w:p>
+    <w:p>
+      <w:pPr>
+        <w:pStyle w:val="ListBullet"/>
+      </w:pPr>
+      <w:r>
+        <w:rPr>
+          <w:b w:val="0"/>
+          <w:i w:val="0"/>
+        </w:rPr>
+        <w:t>Detener el trabajo por seguridad, aunque al final no hubiera peligro.</w:t>
+      </w:r>
+    </w:p>
+    <w:p>
+      <w:pPr>
+        <w:pStyle w:val="ListBullet"/>
+      </w:pPr>
+      <w:r>
+        <w:rPr>
+          <w:b w:val="0"/>
+          <w:i w:val="0"/>
+        </w:rPr>
+        <w:t>Detener o rechazar por calidad cuando te toca hacerlo, aunque cueste metros.</w:t>
+      </w:r>
+    </w:p>
+    <w:p>
+      <w:pPr>
+        <w:pStyle w:val="ListBullet"/>
+      </w:pPr>
+      <w:r>
+        <w:rPr>
+          <w:b w:val="0"/>
+          <w:i w:val="0"/>
+        </w:rPr>
+        <w:t>Reportar un error propio, un casi-accidente o una mala noticia. Al que avisa a tiempo se le agradece.</w:t>
+      </w:r>
+    </w:p>
+    <w:p>
+      <w:pPr>
+        <w:pStyle w:val="ListBullet"/>
+      </w:pPr>
+      <w:r>
+        <w:rPr>
+          <w:b w:val="0"/>
+          <w:i w:val="0"/>
+        </w:rPr>
+        <w:t>Negarte a añadir agua al concreto, a firmar algo que no revisaste o a trabajar sin tu equipo de protección, aunque te lo pida un jefe.</w:t>
+      </w:r>
+    </w:p>
+    <w:p>
+      <w:pPr>
+        <w:pStyle w:val="ListBullet"/>
+      </w:pPr>
+      <w:r>
+        <w:rPr>
+          <w:b w:val="0"/>
+          <w:i w:val="0"/>
+        </w:rPr>
+        <w:t>Una lesión o una enfermedad, ni tu embarazo, tu edad, tu origen, tu religión, tus opiniones o tu vida fuera de la obra.</w:t>
+      </w:r>
+    </w:p>
+    <w:p>
+      <w:pPr>
+        <w:pStyle w:val="Heading2"/>
+      </w:pPr>
+      <w:r>
+        <w:t>Cómo se hace, si llega a pasar</w:t>
+      </w:r>
+    </w:p>
+    <w:p>
+      <w:pPr>
+        <w:pStyle w:val="ListBullet"/>
+      </w:pPr>
+      <w:r>
+        <w:rPr>
+          <w:b w:val="0"/>
+          <w:i w:val="0"/>
+        </w:rPr>
+        <w:t>Toda falta grave se documenta el mismo día: qué pasó, cuándo, quién lo vio y qué evidencia hay (tablero, registro, foto).</w:t>
+      </w:r>
+    </w:p>
+    <w:p>
+      <w:pPr>
+        <w:pStyle w:val="ListBullet"/>
+      </w:pPr>
+      <w:r>
+        <w:rPr>
+          <w:b w:val="0"/>
+          <w:i w:val="0"/>
+        </w:rPr>
+        <w:t xml:space="preserve">Antes de decidir, </w:t>
+      </w:r>
+      <w:r>
+        <w:rPr>
+          <w:b/>
+          <w:i w:val="0"/>
+        </w:rPr>
+        <w:t>se te escucha</w:t>
+      </w:r>
+      <w:r>
+        <w:rPr>
+          <w:b w:val="0"/>
+          <w:i w:val="0"/>
+        </w:rPr>
+        <w:t>: puedes dar tu versión y traer a quien quieras como testigo.</w:t>
+      </w:r>
+    </w:p>
+    <w:p>
+      <w:pPr>
+        <w:pStyle w:val="ListBullet"/>
+      </w:pPr>
+      <w:r>
+        <w:rPr>
+          <w:b w:val="0"/>
+          <w:i w:val="0"/>
+        </w:rPr>
+        <w:t>Lo decide Recursos Humanos con tu jefe directo y el jefe de tu jefe; nunca una sola persona, y nunca en caliente.</w:t>
+      </w:r>
+    </w:p>
+    <w:p>
+      <w:pPr>
+        <w:pStyle w:val="ListBullet"/>
+      </w:pPr>
+      <w:r>
+        <w:rPr>
+          <w:b w:val="0"/>
+          <w:i w:val="0"/>
+        </w:rPr>
+        <w:t xml:space="preserve">Si hay despido, recibes un </w:t>
+      </w:r>
+      <w:r>
+        <w:rPr>
+          <w:b/>
+          <w:i w:val="0"/>
+        </w:rPr>
+        <w:t>aviso por escrito</w:t>
+      </w:r>
+      <w:r>
+        <w:rPr>
+          <w:b w:val="0"/>
+          <w:i w:val="0"/>
+        </w:rPr>
+        <w:t xml:space="preserve"> con la causa exacta y la fecha, como lo pide la ley, y se te paga lo que se te debe: días trabajados, parte proporcional de aguinaldo, vacaciones, prima vacacional y tu fondo de ahorro.</w:t>
+      </w:r>
+    </w:p>
+    <w:p>
+      <w:r>
+        <w:br w:type="page"/>
+      </w:r>
+    </w:p>
+    <w:p>
+      <w:pPr>
+        <w:pStyle w:val="Heading1"/>
+      </w:pPr>
+      <w:r>
+        <w:t>Parte 6 · Lo que te prometemos y lo que te pedimos</w:t>
+      </w:r>
+    </w:p>
+    <w:p>
+      <w:pPr>
+        <w:pStyle w:val="Heading2"/>
+      </w:pPr>
+      <w:r>
+        <w:t>Lo que te prometemos</w:t>
+      </w:r>
+    </w:p>
+    <w:p>
+      <w:pPr>
+        <w:pStyle w:val="ListBullet"/>
+      </w:pPr>
+      <w:r>
+        <w:rPr>
+          <w:b w:val="0"/>
+          <w:i w:val="0"/>
+        </w:rPr>
+        <w:t>Tu pago, siempre el mismo día, con un recibo claro. Tu variable del mes se ve al día en el tablero: sabes cuánto llevas ganado.</w:t>
+      </w:r>
+    </w:p>
+    <w:p>
+      <w:pPr>
+        <w:pStyle w:val="ListBullet"/>
+      </w:pPr>
+      <w:r>
+        <w:rPr>
+          <w:b w:val="0"/>
+          <w:i w:val="0"/>
+        </w:rPr>
+        <w:t>Turnos publicados con dos semanas de anticipación. Ciclos de 12 días de trabajo y 4 de descanso, con transporte pagado a casa. Nunca se dobla turno; la noche lleva 20 % de prima.</w:t>
+      </w:r>
+    </w:p>
+    <w:p>
+      <w:pPr>
+        <w:pStyle w:val="ListBullet"/>
+      </w:pPr>
+      <w:r>
+        <w:rPr>
+          <w:b w:val="0"/>
+          <w:i w:val="0"/>
+        </w:rPr>
+        <w:t>Campamento digno: habitaciones de máximo dos personas, aire acondicionado, internet y lavandería. Tres comidas calientes al día, incluida la de medianoche. Sombra e hidratación en el frente.</w:t>
+      </w:r>
+    </w:p>
+    <w:p>
+      <w:pPr>
+        <w:pStyle w:val="ListBullet"/>
+      </w:pPr>
+      <w:r>
+        <w:rPr>
+          <w:b w:val="0"/>
+          <w:i w:val="0"/>
+        </w:rPr>
+        <w:t>IMSS completo desde el primer día y seguro de gastos médicos mayores para todos. Chequeo médico al entrar y cada seis meses.</w:t>
+      </w:r>
+    </w:p>
+    <w:p>
+      <w:pPr>
+        <w:pStyle w:val="ListBullet"/>
+      </w:pPr>
+      <w:r>
+        <w:rPr>
+          <w:b w:val="0"/>
+          <w:i w:val="0"/>
+        </w:rPr>
+        <w:t>Capacitación pagada y certificaciones que te llevas puestas. Una escalera de crecimiento escrita, con sus requisitos. Si enseñas, cobras un bono por enseñar.</w:t>
+      </w:r>
+    </w:p>
+    <w:p>
+      <w:pPr>
+        <w:pStyle w:val="ListBullet"/>
+      </w:pPr>
+      <w:r>
+        <w:rPr>
+          <w:b w:val="0"/>
+          <w:i w:val="0"/>
+        </w:rPr>
+        <w:t>Fondo de ahorro con aportación igual de la empresa y reparto de utilidades de ley.</w:t>
+      </w:r>
+    </w:p>
+    <w:p>
+      <w:pPr>
+        <w:pStyle w:val="ListBullet"/>
+      </w:pPr>
+      <w:r>
+        <w:rPr>
+          <w:b w:val="0"/>
+          <w:i w:val="0"/>
+        </w:rPr>
+        <w:t>Continuidad: contratos de varios años y prioridad en el siguiente corredor. Y una placa con el nombre de tu cuadrilla en cada tramo que entreguemos.</w:t>
+      </w:r>
+    </w:p>
+    <w:p>
+      <w:pPr>
+        <w:pStyle w:val="Heading2"/>
+      </w:pPr>
+      <w:r>
+        <w:t>Lo que te pedimos</w:t>
+      </w:r>
+    </w:p>
+    <w:p>
+      <w:pPr>
+        <w:pStyle w:val="ListBullet"/>
+      </w:pPr>
+      <w:r>
+        <w:rPr>
+          <w:b w:val="0"/>
+          <w:i w:val="0"/>
+        </w:rPr>
+        <w:t>Llegar a tiempo y en condiciones: descansado, sin alcohol ni sustancias. Un frente nocturno no perdona el cansancio.</w:t>
+      </w:r>
+    </w:p>
+    <w:p>
+      <w:pPr>
+        <w:pStyle w:val="ListBullet"/>
+      </w:pPr>
+      <w:r>
+        <w:rPr>
+          <w:b w:val="0"/>
+          <w:i w:val="0"/>
+        </w:rPr>
+        <w:t>Decir la verdad en el tablero y en la junta, sobre todo cuando la noticia es mala. Un problema dicho a tiempo cuesta minutos; escondido, cuesta semanas.</w:t>
+      </w:r>
+    </w:p>
+    <w:p>
+      <w:pPr>
+        <w:pStyle w:val="ListBullet"/>
+      </w:pPr>
+      <w:r>
+        <w:rPr>
+          <w:b w:val="0"/>
+          <w:i w:val="0"/>
+        </w:rPr>
+        <w:t>Parar cuando algo está mal. Nadie te va a reclamar por detener el trabajo por seguridad o por calidad.</w:t>
+      </w:r>
+    </w:p>
+    <w:p>
+      <w:pPr>
+        <w:pStyle w:val="ListBullet"/>
+      </w:pPr>
+      <w:r>
+        <w:rPr>
+          <w:b w:val="0"/>
+          <w:i w:val="0"/>
+        </w:rPr>
+        <w:t>Nunca añadir agua al concreto, ni permitir que otro lo haga.</w:t>
+      </w:r>
+    </w:p>
+    <w:p>
+      <w:pPr>
+        <w:pStyle w:val="ListBullet"/>
+      </w:pPr>
+      <w:r>
+        <w:rPr>
+          <w:b w:val="0"/>
+          <w:i w:val="0"/>
+        </w:rPr>
+        <w:t>Cuidar al de al lado: su seguridad, su trabajo y su aprendizaje.</w:t>
+      </w:r>
+    </w:p>
+    <w:p>
+      <w:pPr>
+        <w:pStyle w:val="ListBullet"/>
+      </w:pPr>
+      <w:r>
+        <w:rPr>
+          <w:b w:val="0"/>
+          <w:i w:val="0"/>
+        </w:rPr>
+        <w:t>Aprender, y cuando ya sepas, enseñar.</w:t>
+      </w:r>
+    </w:p>
+    <w:p>
+      <w:r>
+        <w:br w:type="page"/>
+      </w:r>
+    </w:p>
+    <w:p>
+      <w:pPr>
+        <w:pStyle w:val="Heading1"/>
+      </w:pPr>
+      <w:r>
+        <w:t>Aceptación y firma</w:t>
+      </w:r>
+    </w:p>
+    <w:p>
+      <w:r>
+        <w:rPr>
+          <w:b w:val="0"/>
+          <w:i w:val="0"/>
+        </w:rPr>
+        <w:t xml:space="preserve">Recibí, leí completo y entendí este documento del puesto </w:t>
+      </w:r>
+      <w:r>
+        <w:rPr>
+          <w:b/>
+          <w:i w:val="0"/>
+        </w:rPr>
+        <w:t>Director de Proyecto</w:t>
+      </w:r>
+      <w:r>
+        <w:rPr>
+          <w:b w:val="0"/>
+          <w:i w:val="0"/>
+        </w:rPr>
+        <w:t>, y resolví mis dudas con mi jefe directo. Acepto:</w:t>
+      </w:r>
+    </w:p>
+    <w:p>
+      <w:pPr>
+        <w:pStyle w:val="ListBullet"/>
+      </w:pPr>
+      <w:r>
+        <w:rPr>
+          <w:b w:val="0"/>
+          <w:i w:val="0"/>
+        </w:rPr>
+        <w:t xml:space="preserve">El puesto de </w:t>
+      </w:r>
+      <w:r>
+        <w:rPr>
+          <w:b/>
+          <w:i w:val="0"/>
+        </w:rPr>
+        <w:t>Director de Proyecto</w:t>
+      </w:r>
+      <w:r>
+        <w:rPr>
+          <w:b w:val="0"/>
+          <w:i w:val="0"/>
+        </w:rPr>
+        <w:t xml:space="preserve">, que reporta a </w:t>
+      </w:r>
+      <w:r>
+        <w:rPr>
+          <w:b/>
+          <w:i w:val="0"/>
+        </w:rPr>
+        <w:t>Dirección general de la empresa</w:t>
+      </w:r>
+      <w:r>
+        <w:rPr>
+          <w:b w:val="0"/>
+          <w:i w:val="0"/>
+        </w:rPr>
+        <w:t>, en el turno día, con guardia.</w:t>
+      </w:r>
+    </w:p>
+    <w:p>
+      <w:pPr>
+        <w:pStyle w:val="ListBullet"/>
+      </w:pPr>
+      <w:r>
+        <w:rPr>
+          <w:b w:val="0"/>
+          <w:i w:val="0"/>
+        </w:rPr>
+        <w:t xml:space="preserve">Un sueldo mensual bruto de </w:t>
+      </w:r>
+      <w:r>
+        <w:rPr>
+          <w:rStyle w:val="M_base"/>
+          <w:b/>
+          <w:i w:val="0"/>
+        </w:rPr>
+        <w:t>$230,000</w:t>
+      </w:r>
+      <w:r>
+        <w:rPr>
+          <w:b w:val="0"/>
+          <w:i w:val="0"/>
+        </w:rPr>
+        <w:t xml:space="preserve">, más prestaciones de ley, y un variable meta de </w:t>
+      </w:r>
+      <w:r>
+        <w:rPr>
+          <w:rStyle w:val="M_varp"/>
+          <w:b/>
+          <w:i w:val="0"/>
+        </w:rPr>
+        <w:t>30</w:t>
+      </w:r>
+      <w:r>
+        <w:rPr>
+          <w:b/>
+          <w:i w:val="0"/>
+        </w:rPr>
+        <w:t xml:space="preserve"> %</w:t>
+      </w:r>
+      <w:r>
+        <w:rPr>
+          <w:b w:val="0"/>
+          <w:i w:val="0"/>
+        </w:rPr>
+        <w:t xml:space="preserve"> del sueldo anual (</w:t>
+      </w:r>
+      <w:r>
+        <w:rPr>
+          <w:rStyle w:val="M_var"/>
+          <w:b w:val="0"/>
+          <w:i w:val="0"/>
+        </w:rPr>
+        <w:t>$828,000</w:t>
+      </w:r>
+      <w:r>
+        <w:rPr>
+          <w:b w:val="0"/>
+          <w:i w:val="0"/>
+        </w:rPr>
+        <w:t>), pagado como dice la parte 4.</w:t>
+      </w:r>
+    </w:p>
+    <w:p>
+      <w:pPr>
+        <w:pStyle w:val="ListBullet"/>
+      </w:pPr>
+      <w:r>
+        <w:rPr>
+          <w:b w:val="0"/>
+          <w:i w:val="0"/>
+        </w:rPr>
+        <w:t xml:space="preserve">Que mi KPI principal es </w:t>
+      </w:r>
+      <w:r>
+        <w:rPr>
+          <w:b/>
+          <w:i w:val="0"/>
+        </w:rPr>
+        <w:t>Km-carril aceptados contra programa</w:t>
+      </w:r>
+      <w:r>
+        <w:rPr>
+          <w:b w:val="0"/>
+          <w:i w:val="0"/>
+        </w:rPr>
+        <w:t>, con meta de 100 % del programa trimestral, con cero desviaciones sin firma y núcleos, IRI y permeabilidad dentro de especificación, y que se me mide como dice la parte 4.</w:t>
+      </w:r>
+    </w:p>
+    <w:p>
+      <w:pPr>
+        <w:pStyle w:val="ListBullet"/>
+      </w:pPr>
+      <w:r>
+        <w:rPr>
+          <w:b w:val="0"/>
+          <w:i w:val="0"/>
+        </w:rPr>
+        <w:t>La capacitación de la parte 3 y las preguntas de comprobación al terminarla.</w:t>
+      </w:r>
+    </w:p>
+    <w:p>
+      <w:pPr>
+        <w:pStyle w:val="ListBullet"/>
+      </w:pPr>
+      <w:r>
+        <w:rPr>
+          <w:b w:val="0"/>
+          <w:i w:val="0"/>
+        </w:rPr>
+        <w:t>Los motivos de despido de la parte 5, que conozco uno por uno.</w:t>
+      </w:r>
+    </w:p>
+    <w:p>
+      <w:pPr>
+        <w:pStyle w:val="ListBullet"/>
+      </w:pPr>
+      <w:r>
+        <w:rPr>
+          <w:b w:val="0"/>
+          <w:i w:val="0"/>
+        </w:rPr>
+        <w:t>Que puedo detener el trabajo por seguridad sin consecuencias, que en esta obra nunca se añade agua al concreto y que una desviación sólo existe si está firmada.</w:t>
+      </w:r>
+    </w:p>
+    <w:p>
+      <w:r>
+        <w:rPr>
+          <w:b w:val="0"/>
+          <w:i w:val="0"/>
+          <w:color w:val="555F78"/>
+          <w:sz w:val="19"/>
+        </w:rPr>
+        <w:t>Este documento es anexo de mi contrato individual de trabajo y forma parte de él; no lo sustituye. Si algo de aquí contradijera al contrato o a la ley, vale lo que más me favorezca.</w:t>
+      </w:r>
+    </w:p>
     <w:p/>
     <w:tbl>
       <w:tblPr>
@@ -3539,14 +4804,15 @@
         <w:tblLook w:firstColumn="1" w:firstRow="1" w:lastColumn="0" w:lastRow="0" w:noHBand="0" w:noVBand="1" w:val="04A0"/>
       </w:tblPr>
       <w:tblGrid>
-        <w:gridCol w:w="3249"/>
-        <w:gridCol w:w="3249"/>
-        <w:gridCol w:w="3249"/>
+        <w:gridCol w:w="2436"/>
+        <w:gridCol w:w="2436"/>
+        <w:gridCol w:w="2436"/>
+        <w:gridCol w:w="2436"/>
       </w:tblGrid>
       <w:tr>
         <w:tc>
           <w:tcPr>
-            <w:tcW w:type="dxa" w:w="1701"/>
+            <w:tcW w:type="dxa" w:w="2154"/>
             <w:shd w:val="clear" w:color="auto" w:fill="001240"/>
           </w:tcPr>
           <w:p>
@@ -3562,7 +4828,7 @@
         </w:tc>
         <w:tc>
           <w:tcPr>
-            <w:tcW w:type="dxa" w:w="3969"/>
+            <w:tcW w:type="dxa" w:w="2494"/>
             <w:shd w:val="clear" w:color="auto" w:fill="001240"/>
           </w:tcPr>
           <w:p>
@@ -3579,7 +4845,7 @@
         </w:tc>
         <w:tc>
           <w:tcPr>
-            <w:tcW w:type="dxa" w:w="3969"/>
+            <w:tcW w:type="dxa" w:w="2494"/>
             <w:shd w:val="clear" w:color="auto" w:fill="001240"/>
           </w:tcPr>
           <w:p>
@@ -3590,7 +4856,24 @@
                 <w:color w:val="FFFFFF"/>
                 <w:sz w:val="19"/>
               </w:rPr>
-              <w:t>Jefe directo (Dirección general de la empresa)</w:t>
+              <w:t>Jefe directo</w:t>
+            </w:r>
+          </w:p>
+        </w:tc>
+        <w:tc>
+          <w:tcPr>
+            <w:tcW w:type="dxa" w:w="2494"/>
+            <w:shd w:val="clear" w:color="auto" w:fill="001240"/>
+          </w:tcPr>
+          <w:p>
+            <w:r/>
+            <w:r>
+              <w:rPr>
+                <w:b/>
+                <w:color w:val="FFFFFF"/>
+                <w:sz w:val="19"/>
+              </w:rPr>
+              <w:t>Por la empresa</w:t>
             </w:r>
           </w:p>
         </w:tc>
@@ -3598,22 +4881,164 @@
       <w:tr>
         <w:tc>
           <w:tcPr>
-            <w:tcW w:type="dxa" w:w="1701"/>
+            <w:tcW w:type="dxa" w:w="2154"/>
           </w:tcPr>
           <w:p>
             <w:r/>
             <w:r>
               <w:rPr>
                 <w:b w:val="0"/>
+                <w:i w:val="0"/>
                 <w:sz w:val="19"/>
               </w:rPr>
-              <w:t>Nombre</w:t>
+              <w:t>Nombre completo, escrito a mano</w:t>
             </w:r>
           </w:p>
         </w:tc>
         <w:tc>
           <w:tcPr>
-            <w:tcW w:type="dxa" w:w="3969"/>
+            <w:tcW w:type="dxa" w:w="2494"/>
+          </w:tcPr>
+          <w:p>
+            <w:r/>
+            <w:r>
+              <w:rPr>
+                <w:b w:val="0"/>
+                <w:i w:val="0"/>
+                <w:sz w:val="19"/>
+              </w:rPr>
+              <w:br/>
+              <w:br/>
+            </w:r>
+          </w:p>
+        </w:tc>
+        <w:tc>
+          <w:tcPr>
+            <w:tcW w:type="dxa" w:w="2494"/>
+          </w:tcPr>
+          <w:p>
+            <w:r/>
+            <w:r>
+              <w:rPr>
+                <w:b w:val="0"/>
+                <w:i w:val="0"/>
+                <w:sz w:val="19"/>
+              </w:rPr>
+              <w:br/>
+              <w:br/>
+            </w:r>
+          </w:p>
+        </w:tc>
+        <w:tc>
+          <w:tcPr>
+            <w:tcW w:type="dxa" w:w="2494"/>
+          </w:tcPr>
+          <w:p>
+            <w:r/>
+            <w:r>
+              <w:rPr>
+                <w:b w:val="0"/>
+                <w:i w:val="0"/>
+                <w:sz w:val="19"/>
+              </w:rPr>
+              <w:br/>
+              <w:br/>
+            </w:r>
+          </w:p>
+        </w:tc>
+      </w:tr>
+      <w:tr>
+        <w:tc>
+          <w:tcPr>
+            <w:tcW w:type="dxa" w:w="2154"/>
+          </w:tcPr>
+          <w:p>
+            <w:r/>
+            <w:r>
+              <w:rPr>
+                <w:b w:val="0"/>
+                <w:i w:val="0"/>
+                <w:sz w:val="19"/>
+              </w:rPr>
+              <w:t>Firma de aceptado</w:t>
+            </w:r>
+          </w:p>
+        </w:tc>
+        <w:tc>
+          <w:tcPr>
+            <w:tcW w:type="dxa" w:w="2494"/>
+          </w:tcPr>
+          <w:p>
+            <w:r/>
+            <w:r>
+              <w:rPr>
+                <w:b w:val="0"/>
+                <w:i w:val="0"/>
+                <w:sz w:val="19"/>
+              </w:rPr>
+              <w:br/>
+              <w:br/>
+              <w:br/>
+            </w:r>
+          </w:p>
+        </w:tc>
+        <w:tc>
+          <w:tcPr>
+            <w:tcW w:type="dxa" w:w="2494"/>
+          </w:tcPr>
+          <w:p>
+            <w:r/>
+            <w:r>
+              <w:rPr>
+                <w:b w:val="0"/>
+                <w:i w:val="0"/>
+                <w:sz w:val="19"/>
+              </w:rPr>
+              <w:br/>
+              <w:br/>
+              <w:br/>
+            </w:r>
+          </w:p>
+        </w:tc>
+        <w:tc>
+          <w:tcPr>
+            <w:tcW w:type="dxa" w:w="2494"/>
+          </w:tcPr>
+          <w:p>
+            <w:r/>
+            <w:r>
+              <w:rPr>
+                <w:b w:val="0"/>
+                <w:i w:val="0"/>
+                <w:sz w:val="19"/>
+              </w:rPr>
+              <w:br/>
+              <w:br/>
+              <w:br/>
+            </w:r>
+          </w:p>
+        </w:tc>
+      </w:tr>
+      <w:tr>
+        <w:tc>
+          <w:tcPr>
+            <w:tcW w:type="dxa" w:w="2154"/>
+          </w:tcPr>
+          <w:p>
+            <w:r/>
+            <w:r>
+              <w:rPr>
+                <w:b w:val="0"/>
+                <w:i w:val="0"/>
+                <w:sz w:val="19"/>
+              </w:rPr>
+              <w:t>Fecha</w:t>
+            </w:r>
+          </w:p>
+        </w:tc>
+        <w:tc>
+          <w:tcPr>
+            <w:tcW w:type="dxa" w:w="2494"/>
           </w:tcPr>
           <w:p>
             <w:r/>
@@ -3621,7 +5046,15 @@
         </w:tc>
         <w:tc>
           <w:tcPr>
-            <w:tcW w:type="dxa" w:w="3969"/>
+            <w:tcW w:type="dxa" w:w="2494"/>
+          </w:tcPr>
+          <w:p>
+            <w:r/>
+          </w:p>
+        </w:tc>
+        <w:tc>
+          <w:tcPr>
+            <w:tcW w:type="dxa" w:w="2494"/>
           </w:tcPr>
           <w:p>
             <w:r/>
@@ -3631,22 +5064,23 @@
       <w:tr>
         <w:tc>
           <w:tcPr>
-            <w:tcW w:type="dxa" w:w="1701"/>
+            <w:tcW w:type="dxa" w:w="2154"/>
           </w:tcPr>
           <w:p>
             <w:r/>
             <w:r>
               <w:rPr>
                 <w:b w:val="0"/>
+                <w:i w:val="0"/>
                 <w:sz w:val="19"/>
               </w:rPr>
-              <w:t>Firma</w:t>
+              <w:t>Lugar</w:t>
             </w:r>
           </w:p>
         </w:tc>
         <w:tc>
           <w:tcPr>
-            <w:tcW w:type="dxa" w:w="3969"/>
+            <w:tcW w:type="dxa" w:w="2494"/>
           </w:tcPr>
           <w:p>
             <w:r/>
@@ -3654,32 +5088,7 @@
         </w:tc>
         <w:tc>
           <w:tcPr>
-            <w:tcW w:type="dxa" w:w="3969"/>
-          </w:tcPr>
-          <w:p>
-            <w:r/>
-          </w:p>
-        </w:tc>
-      </w:tr>
-      <w:tr>
-        <w:tc>
-          <w:tcPr>
-            <w:tcW w:type="dxa" w:w="1701"/>
-          </w:tcPr>
-          <w:p>
-            <w:r/>
-            <w:r>
-              <w:rPr>
-                <w:b w:val="0"/>
-                <w:sz w:val="19"/>
-              </w:rPr>
-              <w:t>Fecha</w:t>
-            </w:r>
-          </w:p>
-        </w:tc>
-        <w:tc>
-          <w:tcPr>
-            <w:tcW w:type="dxa" w:w="3969"/>
+            <w:tcW w:type="dxa" w:w="2494"/>
           </w:tcPr>
           <w:p>
             <w:r/>
@@ -3687,7 +5096,7 @@
         </w:tc>
         <w:tc>
           <w:tcPr>
-            <w:tcW w:type="dxa" w:w="3969"/>
+            <w:tcW w:type="dxa" w:w="2494"/>
           </w:tcPr>
           <w:p>
             <w:r/>
@@ -3696,6 +5105,55 @@
       </w:tr>
     </w:tbl>
     <w:p/>
+    <w:p>
+      <w:r>
+        <w:rPr>
+          <w:b w:val="0"/>
+          <w:i w:val="0"/>
+          <w:color w:val="555F78"/>
+          <w:sz w:val="17"/>
+        </w:rPr>
+        <w:t xml:space="preserve">Puesto: Director de Proyecto · Sueldo mensual bruto: </w:t>
+      </w:r>
+      <w:r>
+        <w:rPr>
+          <w:rStyle w:val="M_base"/>
+          <w:b w:val="0"/>
+          <w:i w:val="0"/>
+          <w:color w:val="555F78"/>
+          <w:sz w:val="17"/>
+        </w:rPr>
+        <w:t>$230,000</w:t>
+      </w:r>
+      <w:r>
+        <w:rPr>
+          <w:b w:val="0"/>
+          <w:i w:val="0"/>
+          <w:color w:val="555F78"/>
+          <w:sz w:val="17"/>
+        </w:rPr>
+        <w:t xml:space="preserve"> · Variable: </w:t>
+      </w:r>
+      <w:r>
+        <w:rPr>
+          <w:rStyle w:val="M_varp"/>
+          <w:b w:val="0"/>
+          <w:i w:val="0"/>
+          <w:color w:val="555F78"/>
+          <w:sz w:val="17"/>
+        </w:rPr>
+        <w:t>30</w:t>
+      </w:r>
+      <w:r>
+        <w:rPr>
+          <w:b w:val="0"/>
+          <w:i w:val="0"/>
+          <w:color w:val="555F78"/>
+          <w:sz w:val="17"/>
+        </w:rPr>
+        <w:t xml:space="preserve"> % · v2 · 2026-09-29</w:t>
+      </w:r>
+    </w:p>
     <w:sectPr>
       <w:footerReference w:type="default" r:id="rId9"/>
       <w:headerReference w:type="default" r:id="rId10"/>
@@ -3719,7 +5177,7 @@
         <w:color w:val="555F78"/>
         <w:sz w:val="16"/>
       </w:rPr>
-      <w:t xml:space="preserve">Carreteras de México · Perfil de puesto · Director de Proyecto · v1 · </w:t>
+      <w:t xml:space="preserve">Carreteras de México · Perfil de puesto · Director de Proyecto · v2 · </w:t>
     </w:r>
     <w:r>
       <w:rPr>
@@ -15803,6 +17261,21 @@
         <w:shd w:val="clear" w:color="auto" w:fill="FBCAA2" w:themeFill="accent6" w:themeFillTint="7F"/>
       </w:tcPr>
     </w:tblStylePr>
+  </w:style>
+  <w:style w:type="character" w:customStyle="1" w:styleId="M_base">
+    <w:name w:val="M_base"/>
+  </w:style>
+  <w:style w:type="character" w:customStyle="1" w:styleId="M_varp">
+    <w:name w:val="M_varp"/>
+  </w:style>
+  <w:style w:type="character" w:customStyle="1" w:styleId="M_var">
+    <w:name w:val="M_var"/>
+  </w:style>
+  <w:style w:type="character" w:customStyle="1" w:styleId="M_total">
+    <w:name w:val="M_total"/>
+  </w:style>
+  <w:style w:type="character" w:customStyle="1" w:styleId="M_anual">
+    <w:name w:val="M_anual"/>
   </w:style>
 </w:styles>
 </file>

</xml_diff>